<commit_message>
[FEAT/FIX]:created maintanance form and rfecatored the older forms to wire them up with api
</commit_message>
<xml_diff>
--- a/MRD_Template4MntCmplain.docx
+++ b/MRD_Template4MntCmplain.docx
@@ -127,7 +127,7 @@
           <w:sz w:val="22"/>
           <w:szCs w:val="22"/>
         </w:rPr>
-        <w:t>Om</w:t>
+        <w:t>Richa</w:t>
       </w:r>
       <w:r>
         <w:rPr>
@@ -431,7 +431,47 @@
           <w:sz w:val="19"/>
           <w:szCs w:val="19"/>
         </w:rPr>
-        <w:t>1.  Save a copy — rename to  MRD_[ModuleName].docx  before editing.</w:t>
+        <w:t xml:space="preserve">1.  Save a copy — rename </w:t>
+      </w:r>
+      <w:proofErr w:type="gramStart"/>
+      <w:r>
+        <w:rPr>
+          <w:rFonts w:ascii="Calibri" w:eastAsia="Calibri" w:hAnsi="Calibri" w:cs="Calibri"/>
+          <w:color w:val="B45309"/>
+          <w:sz w:val="19"/>
+          <w:szCs w:val="19"/>
+        </w:rPr>
+        <w:t>to  MRD</w:t>
+      </w:r>
+      <w:proofErr w:type="gramEnd"/>
+      <w:r>
+        <w:rPr>
+          <w:rFonts w:ascii="Calibri" w:eastAsia="Calibri" w:hAnsi="Calibri" w:cs="Calibri"/>
+          <w:color w:val="B45309"/>
+          <w:sz w:val="19"/>
+          <w:szCs w:val="19"/>
+        </w:rPr>
+        <w:t>_[ModuleName].</w:t>
+      </w:r>
+      <w:proofErr w:type="gramStart"/>
+      <w:r>
+        <w:rPr>
+          <w:rFonts w:ascii="Calibri" w:eastAsia="Calibri" w:hAnsi="Calibri" w:cs="Calibri"/>
+          <w:color w:val="B45309"/>
+          <w:sz w:val="19"/>
+          <w:szCs w:val="19"/>
+        </w:rPr>
+        <w:t>docx  before</w:t>
+      </w:r>
+      <w:proofErr w:type="gramEnd"/>
+      <w:r>
+        <w:rPr>
+          <w:rFonts w:ascii="Calibri" w:eastAsia="Calibri" w:hAnsi="Calibri" w:cs="Calibri"/>
+          <w:color w:val="B45309"/>
+          <w:sz w:val="19"/>
+          <w:szCs w:val="19"/>
+        </w:rPr>
+        <w:t xml:space="preserve"> editing.</w:t>
       </w:r>
     </w:p>
     <w:p>
@@ -567,7 +607,7 @@
         <w:t xml:space="preserve">Module Name: </w:t>
       </w:r>
       <w:r>
-        <w:t>Assets</w:t>
+        <w:t>Maintenance</w:t>
       </w:r>
     </w:p>
     <w:p>
@@ -602,7 +642,7 @@
           <w:sz w:val="21"/>
           <w:szCs w:val="21"/>
         </w:rPr>
-        <w:t>AIS</w:t>
+        <w:t>MNT</w:t>
       </w:r>
       <w:r>
         <w:rPr>
@@ -637,63 +677,7 @@
           <w:sz w:val="21"/>
           <w:szCs w:val="21"/>
         </w:rPr>
-        <w:t>Update</w:t>
-      </w:r>
-      <w:r>
-        <w:rPr>
-          <w:rFonts w:ascii="Calibri" w:eastAsia="Calibri" w:hAnsi="Calibri" w:cs="Calibri"/>
-          <w:color w:val="166534"/>
-          <w:sz w:val="21"/>
-          <w:szCs w:val="21"/>
-        </w:rPr>
-        <w:t xml:space="preserve"> Asset</w:t>
-      </w:r>
-      <w:r>
-        <w:rPr>
-          <w:rFonts w:ascii="Calibri" w:eastAsia="Calibri" w:hAnsi="Calibri" w:cs="Calibri"/>
-          <w:color w:val="166534"/>
-          <w:sz w:val="21"/>
-          <w:szCs w:val="21"/>
-        </w:rPr>
-        <w:t>’</w:t>
-      </w:r>
-      <w:r>
-        <w:rPr>
-          <w:rFonts w:ascii="Calibri" w:eastAsia="Calibri" w:hAnsi="Calibri" w:cs="Calibri"/>
-          <w:color w:val="166534"/>
-          <w:sz w:val="21"/>
-          <w:szCs w:val="21"/>
-        </w:rPr>
-        <w:t>s</w:t>
-      </w:r>
-      <w:r>
-        <w:rPr>
-          <w:rFonts w:ascii="Calibri" w:eastAsia="Calibri" w:hAnsi="Calibri" w:cs="Calibri"/>
-          <w:color w:val="166534"/>
-          <w:sz w:val="21"/>
-          <w:szCs w:val="21"/>
-        </w:rPr>
-        <w:t xml:space="preserve"> item (</w:t>
-      </w:r>
-      <w:proofErr w:type="spellStart"/>
-      <w:r>
-        <w:rPr>
-          <w:rFonts w:ascii="Calibri" w:eastAsia="Calibri" w:hAnsi="Calibri" w:cs="Calibri"/>
-          <w:color w:val="166534"/>
-          <w:sz w:val="21"/>
-          <w:szCs w:val="21"/>
-        </w:rPr>
-        <w:t>SrNo</w:t>
-      </w:r>
-      <w:proofErr w:type="spellEnd"/>
-      <w:r>
-        <w:rPr>
-          <w:rFonts w:ascii="Calibri" w:eastAsia="Calibri" w:hAnsi="Calibri" w:cs="Calibri"/>
-          <w:color w:val="166534"/>
-          <w:sz w:val="21"/>
-          <w:szCs w:val="21"/>
-        </w:rPr>
-        <w:t>) health status</w:t>
+        <w:t>to raise complaint against assets item</w:t>
       </w:r>
       <w:r>
         <w:rPr>
@@ -1032,6 +1016,9 @@
         <w:jc w:val="center"/>
       </w:pPr>
       <w:r>
+        <w:rPr>
+          <w:noProof/>
+        </w:rPr>
         <w:drawing>
           <wp:inline distT="0" distB="0" distL="0" distR="0" wp14:anchorId="330B1B96" wp14:editId="7DC47C18">
             <wp:extent cx="4605655" cy="2595033"/>
@@ -1164,6 +1151,7 @@
         </w:rPr>
         <w:t xml:space="preserve"> </w:t>
       </w:r>
+      <w:proofErr w:type="spellStart"/>
       <w:r>
         <w:rPr>
           <w:rFonts w:ascii="Consolas" w:hAnsi="Consolas" w:cs="Consolas"/>
@@ -1171,8 +1159,9 @@
           <w:sz w:val="19"/>
           <w:szCs w:val="19"/>
         </w:rPr>
-        <w:t xml:space="preserve">Date(System Date), Complaint No. (Auto generated code), Division (Drop down), location (dropdown), </w:t>
-      </w:r>
+        <w:t>trandate</w:t>
+      </w:r>
+      <w:proofErr w:type="spellEnd"/>
       <w:r>
         <w:rPr>
           <w:rFonts w:ascii="Consolas" w:hAnsi="Consolas" w:cs="Consolas"/>
@@ -1180,7 +1169,7 @@
           <w:sz w:val="19"/>
           <w:szCs w:val="19"/>
         </w:rPr>
-        <w:t>department</w:t>
+        <w:t xml:space="preserve"> </w:t>
       </w:r>
       <w:r>
         <w:rPr>
@@ -1189,8 +1178,9 @@
           <w:sz w:val="19"/>
           <w:szCs w:val="19"/>
         </w:rPr>
-        <w:t xml:space="preserve"> (Drop down), config(dropdown)</w:t>
-      </w:r>
+        <w:t xml:space="preserve">(System Date), </w:t>
+      </w:r>
+      <w:proofErr w:type="spellStart"/>
       <w:r>
         <w:rPr>
           <w:rFonts w:ascii="Consolas" w:hAnsi="Consolas" w:cs="Consolas"/>
@@ -1198,8 +1188,9 @@
           <w:sz w:val="19"/>
           <w:szCs w:val="19"/>
         </w:rPr>
-        <w:t>,</w:t>
-      </w:r>
+        <w:t>trancode</w:t>
+      </w:r>
+      <w:proofErr w:type="spellEnd"/>
       <w:r>
         <w:rPr>
           <w:rFonts w:ascii="Consolas" w:hAnsi="Consolas" w:cs="Consolas"/>
@@ -1216,8 +1207,9 @@
           <w:sz w:val="19"/>
           <w:szCs w:val="19"/>
         </w:rPr>
-        <w:t>Complaint by (Login User Name),</w:t>
-      </w:r>
+        <w:t xml:space="preserve">(Auto generated code), </w:t>
+      </w:r>
+      <w:proofErr w:type="spellStart"/>
       <w:r>
         <w:rPr>
           <w:rFonts w:ascii="Consolas" w:hAnsi="Consolas" w:cs="Consolas"/>
@@ -1225,7 +1217,227 @@
           <w:sz w:val="19"/>
           <w:szCs w:val="19"/>
         </w:rPr>
-        <w:t xml:space="preserve"> Remark (text area)</w:t>
+        <w:t>divisionid</w:t>
+      </w:r>
+      <w:proofErr w:type="spellEnd"/>
+      <w:r>
+        <w:rPr>
+          <w:rFonts w:ascii="Consolas" w:hAnsi="Consolas" w:cs="Consolas"/>
+          <w:color w:val="000000"/>
+          <w:sz w:val="19"/>
+          <w:szCs w:val="19"/>
+        </w:rPr>
+        <w:t xml:space="preserve"> </w:t>
+      </w:r>
+      <w:r>
+        <w:rPr>
+          <w:rFonts w:ascii="Consolas" w:hAnsi="Consolas" w:cs="Consolas"/>
+          <w:color w:val="000000"/>
+          <w:sz w:val="19"/>
+          <w:szCs w:val="19"/>
+        </w:rPr>
+        <w:t xml:space="preserve">(Drop down), </w:t>
+      </w:r>
+      <w:proofErr w:type="spellStart"/>
+      <w:r>
+        <w:rPr>
+          <w:rFonts w:ascii="Consolas" w:hAnsi="Consolas" w:cs="Consolas"/>
+          <w:color w:val="000000"/>
+          <w:sz w:val="19"/>
+          <w:szCs w:val="19"/>
+        </w:rPr>
+        <w:t>fromlocationid</w:t>
+      </w:r>
+      <w:proofErr w:type="spellEnd"/>
+      <w:r>
+        <w:rPr>
+          <w:rFonts w:ascii="Consolas" w:hAnsi="Consolas" w:cs="Consolas"/>
+          <w:color w:val="000000"/>
+          <w:sz w:val="19"/>
+          <w:szCs w:val="19"/>
+        </w:rPr>
+        <w:t xml:space="preserve"> </w:t>
+      </w:r>
+      <w:r>
+        <w:rPr>
+          <w:rFonts w:ascii="Consolas" w:hAnsi="Consolas" w:cs="Consolas"/>
+          <w:color w:val="000000"/>
+          <w:sz w:val="19"/>
+          <w:szCs w:val="19"/>
+        </w:rPr>
+        <w:t>(dropdown</w:t>
+      </w:r>
+      <w:r>
+        <w:rPr>
+          <w:rFonts w:ascii="Consolas" w:hAnsi="Consolas" w:cs="Consolas"/>
+          <w:color w:val="000000"/>
+          <w:sz w:val="19"/>
+          <w:szCs w:val="19"/>
+        </w:rPr>
+        <w:t xml:space="preserve"> – cascade in case of change </w:t>
+      </w:r>
+      <w:proofErr w:type="spellStart"/>
+      <w:r>
+        <w:rPr>
+          <w:rFonts w:ascii="Consolas" w:hAnsi="Consolas" w:cs="Consolas"/>
+          <w:color w:val="000000"/>
+          <w:sz w:val="19"/>
+          <w:szCs w:val="19"/>
+        </w:rPr>
+        <w:t>divisionid</w:t>
+      </w:r>
+      <w:proofErr w:type="spellEnd"/>
+      <w:r>
+        <w:rPr>
+          <w:rFonts w:ascii="Consolas" w:hAnsi="Consolas" w:cs="Consolas"/>
+          <w:color w:val="000000"/>
+          <w:sz w:val="19"/>
+          <w:szCs w:val="19"/>
+        </w:rPr>
+        <w:t xml:space="preserve">), </w:t>
+      </w:r>
+      <w:proofErr w:type="spellStart"/>
+      <w:r>
+        <w:rPr>
+          <w:rFonts w:ascii="Consolas" w:hAnsi="Consolas" w:cs="Consolas"/>
+          <w:color w:val="000000"/>
+          <w:sz w:val="19"/>
+          <w:szCs w:val="19"/>
+        </w:rPr>
+        <w:t>fromdeptid</w:t>
+      </w:r>
+      <w:proofErr w:type="spellEnd"/>
+      <w:r>
+        <w:rPr>
+          <w:rFonts w:ascii="Consolas" w:hAnsi="Consolas" w:cs="Consolas"/>
+          <w:color w:val="000000"/>
+          <w:sz w:val="19"/>
+          <w:szCs w:val="19"/>
+        </w:rPr>
+        <w:t xml:space="preserve"> </w:t>
+      </w:r>
+      <w:r>
+        <w:rPr>
+          <w:rFonts w:ascii="Consolas" w:hAnsi="Consolas" w:cs="Consolas"/>
+          <w:color w:val="000000"/>
+          <w:sz w:val="19"/>
+          <w:szCs w:val="19"/>
+        </w:rPr>
+        <w:t xml:space="preserve">(Drop down), </w:t>
+      </w:r>
+      <w:proofErr w:type="spellStart"/>
+      <w:proofErr w:type="gramStart"/>
+      <w:r>
+        <w:rPr>
+          <w:rFonts w:ascii="Consolas" w:hAnsi="Consolas" w:cs="Consolas"/>
+          <w:color w:val="000000"/>
+          <w:sz w:val="19"/>
+          <w:szCs w:val="19"/>
+        </w:rPr>
+        <w:t>config</w:t>
+      </w:r>
+      <w:r>
+        <w:rPr>
+          <w:rFonts w:ascii="Consolas" w:hAnsi="Consolas" w:cs="Consolas"/>
+          <w:color w:val="000000"/>
+          <w:sz w:val="19"/>
+          <w:szCs w:val="19"/>
+        </w:rPr>
+        <w:t>id</w:t>
+      </w:r>
+      <w:proofErr w:type="spellEnd"/>
+      <w:r>
+        <w:rPr>
+          <w:rFonts w:ascii="Consolas" w:hAnsi="Consolas" w:cs="Consolas"/>
+          <w:color w:val="000000"/>
+          <w:sz w:val="19"/>
+          <w:szCs w:val="19"/>
+        </w:rPr>
+        <w:t>(</w:t>
+      </w:r>
+      <w:proofErr w:type="gramEnd"/>
+      <w:r>
+        <w:rPr>
+          <w:rFonts w:ascii="Consolas" w:hAnsi="Consolas" w:cs="Consolas"/>
+          <w:color w:val="000000"/>
+          <w:sz w:val="19"/>
+          <w:szCs w:val="19"/>
+        </w:rPr>
+        <w:t>dropdown</w:t>
+      </w:r>
+      <w:r>
+        <w:rPr>
+          <w:rFonts w:ascii="Consolas" w:hAnsi="Consolas" w:cs="Consolas"/>
+          <w:color w:val="000000"/>
+          <w:sz w:val="19"/>
+          <w:szCs w:val="19"/>
+        </w:rPr>
+        <w:t>-</w:t>
+      </w:r>
+      <w:r>
+        <w:rPr>
+          <w:rFonts w:ascii="Consolas" w:hAnsi="Consolas" w:cs="Consolas"/>
+          <w:color w:val="000000"/>
+          <w:sz w:val="19"/>
+          <w:szCs w:val="19"/>
+        </w:rPr>
+        <w:t xml:space="preserve"> </w:t>
+      </w:r>
+      <w:r>
+        <w:rPr>
+          <w:rFonts w:ascii="Consolas" w:hAnsi="Consolas" w:cs="Consolas"/>
+          <w:color w:val="000000"/>
+          <w:sz w:val="19"/>
+          <w:szCs w:val="19"/>
+        </w:rPr>
+        <w:t xml:space="preserve">cascade in case of change </w:t>
+      </w:r>
+      <w:proofErr w:type="spellStart"/>
+      <w:r>
+        <w:rPr>
+          <w:rFonts w:ascii="Consolas" w:hAnsi="Consolas" w:cs="Consolas"/>
+          <w:color w:val="000000"/>
+          <w:sz w:val="19"/>
+          <w:szCs w:val="19"/>
+        </w:rPr>
+        <w:t>divisionid</w:t>
+      </w:r>
+      <w:proofErr w:type="spellEnd"/>
+      <w:r>
+        <w:rPr>
+          <w:rFonts w:ascii="Consolas" w:hAnsi="Consolas" w:cs="Consolas"/>
+          <w:color w:val="000000"/>
+          <w:sz w:val="19"/>
+          <w:szCs w:val="19"/>
+        </w:rPr>
+        <w:t>)</w:t>
+      </w:r>
+      <w:r>
+        <w:rPr>
+          <w:rFonts w:ascii="Consolas" w:hAnsi="Consolas" w:cs="Consolas"/>
+          <w:color w:val="000000"/>
+          <w:sz w:val="19"/>
+          <w:szCs w:val="19"/>
+        </w:rPr>
+        <w:t>,</w:t>
+      </w:r>
+      <w:r>
+        <w:rPr>
+          <w:rFonts w:ascii="Consolas" w:hAnsi="Consolas" w:cs="Consolas"/>
+          <w:color w:val="000000"/>
+          <w:sz w:val="19"/>
+          <w:szCs w:val="19"/>
+        </w:rPr>
+        <w:t xml:space="preserve"> </w:t>
+      </w:r>
+      <w:r>
+        <w:rPr>
+          <w:rFonts w:ascii="Consolas" w:hAnsi="Consolas" w:cs="Consolas"/>
+          <w:color w:val="000000"/>
+          <w:sz w:val="19"/>
+          <w:szCs w:val="19"/>
+        </w:rPr>
+        <w:t>Remark (text area)</w:t>
       </w:r>
     </w:p>
     <w:p>
@@ -1238,7 +1450,7 @@
       </w:r>
       <w:proofErr w:type="spellStart"/>
       <w:r>
-        <w:t>rb_mntcomplmst</w:t>
+        <w:t>rb_mntcpnmst</w:t>
       </w:r>
       <w:proofErr w:type="spellEnd"/>
       <w:r>
@@ -1304,7 +1516,7 @@
           <w:sz w:val="21"/>
           <w:szCs w:val="21"/>
         </w:rPr>
-        <w:t>rb_mntcompldet</w:t>
+        <w:t>rb_mntcpndet</w:t>
       </w:r>
       <w:proofErr w:type="spellEnd"/>
       <w:r>
@@ -2557,7 +2769,17 @@
                 <w:sz w:val="19"/>
                 <w:szCs w:val="19"/>
               </w:rPr>
-              <w:t>fn_tbl_fetchuserw</w:t>
+              <w:t>fn_tbl_</w:t>
+            </w:r>
+            <w:proofErr w:type="gramStart"/>
+            <w:r>
+              <w:rPr>
+                <w:rFonts w:ascii="Calibri" w:eastAsia="Calibri" w:hAnsi="Calibri" w:cs="Calibri"/>
+                <w:color w:val="166534"/>
+                <w:sz w:val="19"/>
+                <w:szCs w:val="19"/>
+              </w:rPr>
+              <w:t>fetchuserw</w:t>
             </w:r>
             <w:r>
               <w:rPr>
@@ -2585,7 +2807,57 @@
                 <w:sz w:val="19"/>
                 <w:szCs w:val="19"/>
               </w:rPr>
-              <w:t>(@prmuserid , @prmcompanyid , @prmyearid)</w:t>
+              <w:t>(</w:t>
+            </w:r>
+            <w:proofErr w:type="gramEnd"/>
+            <w:r>
+              <w:rPr>
+                <w:rFonts w:ascii="Calibri" w:eastAsia="Calibri" w:hAnsi="Calibri" w:cs="Calibri"/>
+                <w:color w:val="166534"/>
+                <w:sz w:val="19"/>
+                <w:szCs w:val="19"/>
+              </w:rPr>
+              <w:t>@</w:t>
+            </w:r>
+            <w:proofErr w:type="gramStart"/>
+            <w:r>
+              <w:rPr>
+                <w:rFonts w:ascii="Calibri" w:eastAsia="Calibri" w:hAnsi="Calibri" w:cs="Calibri"/>
+                <w:color w:val="166534"/>
+                <w:sz w:val="19"/>
+                <w:szCs w:val="19"/>
+              </w:rPr>
+              <w:t>prmuserid ,</w:t>
+            </w:r>
+            <w:proofErr w:type="gramEnd"/>
+            <w:r>
+              <w:rPr>
+                <w:rFonts w:ascii="Calibri" w:eastAsia="Calibri" w:hAnsi="Calibri" w:cs="Calibri"/>
+                <w:color w:val="166534"/>
+                <w:sz w:val="19"/>
+                <w:szCs w:val="19"/>
+              </w:rPr>
+              <w:t xml:space="preserve"> @</w:t>
+            </w:r>
+            <w:proofErr w:type="gramStart"/>
+            <w:r>
+              <w:rPr>
+                <w:rFonts w:ascii="Calibri" w:eastAsia="Calibri" w:hAnsi="Calibri" w:cs="Calibri"/>
+                <w:color w:val="166534"/>
+                <w:sz w:val="19"/>
+                <w:szCs w:val="19"/>
+              </w:rPr>
+              <w:t>prmcompanyid ,</w:t>
+            </w:r>
+            <w:proofErr w:type="gramEnd"/>
+            <w:r>
+              <w:rPr>
+                <w:rFonts w:ascii="Calibri" w:eastAsia="Calibri" w:hAnsi="Calibri" w:cs="Calibri"/>
+                <w:color w:val="166534"/>
+                <w:sz w:val="19"/>
+                <w:szCs w:val="19"/>
+              </w:rPr>
+              <w:t xml:space="preserve"> @prmyearid)</w:t>
             </w:r>
           </w:p>
         </w:tc>
@@ -2807,7 +3079,17 @@
                 <w:sz w:val="19"/>
                 <w:szCs w:val="19"/>
               </w:rPr>
-              <w:t>fn_gen_fetch</w:t>
+              <w:t>fn_gen_</w:t>
+            </w:r>
+            <w:proofErr w:type="gramStart"/>
+            <w:r>
+              <w:rPr>
+                <w:rFonts w:ascii="Consolas" w:hAnsi="Consolas" w:cs="Consolas"/>
+                <w:color w:val="000000"/>
+                <w:sz w:val="19"/>
+                <w:szCs w:val="19"/>
+              </w:rPr>
+              <w:t>fetch</w:t>
             </w:r>
             <w:r>
               <w:rPr>
@@ -2835,7 +3117,57 @@
                 <w:sz w:val="19"/>
                 <w:szCs w:val="19"/>
               </w:rPr>
-              <w:t>(@prmcompanyid , @prmloginid , @prmlocationtype)</w:t>
+              <w:t>(</w:t>
+            </w:r>
+            <w:proofErr w:type="gramEnd"/>
+            <w:r>
+              <w:rPr>
+                <w:rFonts w:ascii="Consolas" w:hAnsi="Consolas" w:cs="Consolas"/>
+                <w:color w:val="000000"/>
+                <w:sz w:val="19"/>
+                <w:szCs w:val="19"/>
+              </w:rPr>
+              <w:t>@</w:t>
+            </w:r>
+            <w:proofErr w:type="gramStart"/>
+            <w:r>
+              <w:rPr>
+                <w:rFonts w:ascii="Consolas" w:hAnsi="Consolas" w:cs="Consolas"/>
+                <w:color w:val="000000"/>
+                <w:sz w:val="19"/>
+                <w:szCs w:val="19"/>
+              </w:rPr>
+              <w:t>prmcompanyid ,</w:t>
+            </w:r>
+            <w:proofErr w:type="gramEnd"/>
+            <w:r>
+              <w:rPr>
+                <w:rFonts w:ascii="Consolas" w:hAnsi="Consolas" w:cs="Consolas"/>
+                <w:color w:val="000000"/>
+                <w:sz w:val="19"/>
+                <w:szCs w:val="19"/>
+              </w:rPr>
+              <w:t xml:space="preserve"> @</w:t>
+            </w:r>
+            <w:proofErr w:type="gramStart"/>
+            <w:r>
+              <w:rPr>
+                <w:rFonts w:ascii="Consolas" w:hAnsi="Consolas" w:cs="Consolas"/>
+                <w:color w:val="000000"/>
+                <w:sz w:val="19"/>
+                <w:szCs w:val="19"/>
+              </w:rPr>
+              <w:t>prmloginid ,</w:t>
+            </w:r>
+            <w:proofErr w:type="gramEnd"/>
+            <w:r>
+              <w:rPr>
+                <w:rFonts w:ascii="Consolas" w:hAnsi="Consolas" w:cs="Consolas"/>
+                <w:color w:val="000000"/>
+                <w:sz w:val="19"/>
+                <w:szCs w:val="19"/>
+              </w:rPr>
+              <w:t xml:space="preserve"> @prmlocationtype)</w:t>
             </w:r>
           </w:p>
         </w:tc>
@@ -2884,7 +3216,7 @@
           <w:p>
             <w:proofErr w:type="spellStart"/>
             <w:r>
-              <w:t>deptid</w:t>
+              <w:t>fromdeptid</w:t>
             </w:r>
             <w:proofErr w:type="spellEnd"/>
           </w:p>
@@ -3070,7 +3402,27 @@
                 <w:szCs w:val="19"/>
                 <w:lang w:val="en-IN"/>
               </w:rPr>
-              <w:t>fn_gen_fetchdepartmentmaster</w:t>
+              <w:t>fn_gen_fetch</w:t>
+            </w:r>
+            <w:r>
+              <w:rPr>
+                <w:rFonts w:ascii="Consolas" w:hAnsi="Consolas" w:cs="Consolas"/>
+                <w:color w:val="000000"/>
+                <w:sz w:val="19"/>
+                <w:szCs w:val="19"/>
+                <w:lang w:val="en-IN"/>
+              </w:rPr>
+              <w:t>from</w:t>
+            </w:r>
+            <w:r>
+              <w:rPr>
+                <w:rFonts w:ascii="Consolas" w:hAnsi="Consolas" w:cs="Consolas"/>
+                <w:color w:val="000000"/>
+                <w:sz w:val="19"/>
+                <w:szCs w:val="19"/>
+                <w:lang w:val="en-IN"/>
+              </w:rPr>
+              <w:t>departmentmaster</w:t>
             </w:r>
             <w:proofErr w:type="spellEnd"/>
           </w:p>
@@ -3090,7 +3442,27 @@
                 <w:sz w:val="19"/>
                 <w:szCs w:val="19"/>
               </w:rPr>
-              <w:t>(@prmcompanyid , @prmloginid</w:t>
+              <w:t>(@</w:t>
+            </w:r>
+            <w:proofErr w:type="gramStart"/>
+            <w:r>
+              <w:rPr>
+                <w:rFonts w:ascii="Consolas" w:hAnsi="Consolas" w:cs="Consolas"/>
+                <w:color w:val="000000"/>
+                <w:sz w:val="19"/>
+                <w:szCs w:val="19"/>
+              </w:rPr>
+              <w:t>prmcompanyid ,</w:t>
+            </w:r>
+            <w:proofErr w:type="gramEnd"/>
+            <w:r>
+              <w:rPr>
+                <w:rFonts w:ascii="Consolas" w:hAnsi="Consolas" w:cs="Consolas"/>
+                <w:color w:val="000000"/>
+                <w:sz w:val="19"/>
+                <w:szCs w:val="19"/>
+              </w:rPr>
+              <w:t xml:space="preserve"> @prmloginid</w:t>
             </w:r>
             <w:r>
               <w:rPr>
@@ -3329,7 +3701,18 @@
                 <w:szCs w:val="19"/>
                 <w:lang w:val="en-IN"/>
               </w:rPr>
-              <w:t>fn_tbl_ddl_maintenanceconfiguration</w:t>
+              <w:t>fn_tbl_ddl_</w:t>
+            </w:r>
+            <w:proofErr w:type="gramStart"/>
+            <w:r>
+              <w:rPr>
+                <w:rFonts w:ascii="Consolas" w:hAnsi="Consolas" w:cs="Consolas"/>
+                <w:color w:val="000000"/>
+                <w:sz w:val="19"/>
+                <w:szCs w:val="19"/>
+                <w:lang w:val="en-IN"/>
+              </w:rPr>
+              <w:t>maintenanceconfiguration</w:t>
             </w:r>
             <w:proofErr w:type="spellEnd"/>
             <w:r>
@@ -3343,6 +3726,7 @@
               </w:rPr>
               <w:t>(</w:t>
             </w:r>
+            <w:proofErr w:type="gramEnd"/>
           </w:p>
           <w:p>
             <w:pPr>
@@ -3365,6 +3749,7 @@
               </w:rPr>
               <w:t xml:space="preserve">@prmcompanyid </w:t>
             </w:r>
+            <w:proofErr w:type="gramStart"/>
             <w:r>
               <w:rPr>
                 <w:rFonts w:ascii="Consolas" w:hAnsi="Consolas" w:cs="Consolas"/>
@@ -3383,6 +3768,7 @@
               </w:rPr>
               <w:t>(</w:t>
             </w:r>
+            <w:proofErr w:type="gramEnd"/>
             <w:r>
               <w:rPr>
                 <w:rFonts w:ascii="Consolas" w:hAnsi="Consolas" w:cs="Consolas"/>
@@ -3450,6 +3836,7 @@
               </w:rPr>
               <w:t xml:space="preserve">@prmdivisionid </w:t>
             </w:r>
+            <w:proofErr w:type="gramStart"/>
             <w:r>
               <w:rPr>
                 <w:rFonts w:ascii="Consolas" w:hAnsi="Consolas" w:cs="Consolas"/>
@@ -3468,6 +3855,7 @@
               </w:rPr>
               <w:t>(</w:t>
             </w:r>
+            <w:proofErr w:type="gramEnd"/>
             <w:r>
               <w:rPr>
                 <w:rFonts w:ascii="Consolas" w:hAnsi="Consolas" w:cs="Consolas"/>
@@ -3535,6 +3923,7 @@
               </w:rPr>
               <w:t xml:space="preserve">@prmyearid </w:t>
             </w:r>
+            <w:proofErr w:type="gramStart"/>
             <w:r>
               <w:rPr>
                 <w:rFonts w:ascii="Consolas" w:hAnsi="Consolas" w:cs="Consolas"/>
@@ -3553,6 +3942,7 @@
               </w:rPr>
               <w:t>(</w:t>
             </w:r>
+            <w:proofErr w:type="gramEnd"/>
             <w:r>
               <w:rPr>
                 <w:rFonts w:ascii="Consolas" w:hAnsi="Consolas" w:cs="Consolas"/>
@@ -3620,6 +4010,7 @@
               </w:rPr>
               <w:t xml:space="preserve">@prmuserid </w:t>
             </w:r>
+            <w:proofErr w:type="gramStart"/>
             <w:r>
               <w:rPr>
                 <w:rFonts w:ascii="Consolas" w:hAnsi="Consolas" w:cs="Consolas"/>
@@ -3638,6 +4029,7 @@
               </w:rPr>
               <w:t>(</w:t>
             </w:r>
+            <w:proofErr w:type="gramEnd"/>
             <w:r>
               <w:rPr>
                 <w:rFonts w:ascii="Consolas" w:hAnsi="Consolas" w:cs="Consolas"/>
@@ -3705,6 +4097,7 @@
               </w:rPr>
               <w:t xml:space="preserve">@prmformtag </w:t>
             </w:r>
+            <w:proofErr w:type="gramStart"/>
             <w:r>
               <w:rPr>
                 <w:rFonts w:ascii="Consolas" w:hAnsi="Consolas" w:cs="Consolas"/>
@@ -3741,6 +4134,7 @@
               </w:rPr>
               <w:t>)=</w:t>
             </w:r>
+            <w:proofErr w:type="gramEnd"/>
             <w:r>
               <w:rPr>
                 <w:rFonts w:ascii="Calibri" w:eastAsia="Calibri" w:hAnsi="Calibri" w:cs="Calibri"/>
@@ -3825,6 +4219,7 @@
               </w:rPr>
               <w:t xml:space="preserve">@prmreftype </w:t>
             </w:r>
+            <w:proofErr w:type="gramStart"/>
             <w:r>
               <w:rPr>
                 <w:rFonts w:ascii="Consolas" w:hAnsi="Consolas" w:cs="Consolas"/>
@@ -3859,7 +4254,26 @@
                 <w:sz w:val="19"/>
                 <w:szCs w:val="19"/>
               </w:rPr>
-              <w:t>)=“HS”,</w:t>
+              <w:t>)=</w:t>
+            </w:r>
+            <w:proofErr w:type="gramEnd"/>
+            <w:r>
+              <w:rPr>
+                <w:rFonts w:ascii="Consolas" w:hAnsi="Consolas" w:cs="Consolas"/>
+                <w:color w:val="808080"/>
+                <w:sz w:val="19"/>
+                <w:szCs w:val="19"/>
+              </w:rPr>
+              <w:t>“CPN</w:t>
+            </w:r>
+            <w:r>
+              <w:rPr>
+                <w:rFonts w:ascii="Consolas" w:hAnsi="Consolas" w:cs="Consolas"/>
+                <w:color w:val="808080"/>
+                <w:sz w:val="19"/>
+                <w:szCs w:val="19"/>
+              </w:rPr>
+              <w:t>”,</w:t>
             </w:r>
             <w:r>
               <w:rPr>
@@ -3910,6 +4324,7 @@
               </w:rPr>
               <w:t xml:space="preserve"> </w:t>
             </w:r>
+            <w:proofErr w:type="gramStart"/>
             <w:r>
               <w:rPr>
                 <w:rFonts w:ascii="Consolas" w:hAnsi="Consolas" w:cs="Consolas"/>
@@ -3928,6 +4343,7 @@
               </w:rPr>
               <w:t>(</w:t>
             </w:r>
+            <w:proofErr w:type="gramEnd"/>
             <w:r>
               <w:rPr>
                 <w:rFonts w:ascii="Consolas" w:hAnsi="Consolas" w:cs="Consolas"/>
@@ -4012,6 +4428,7 @@
               </w:rPr>
               <w:t xml:space="preserve"> </w:t>
             </w:r>
+            <w:proofErr w:type="gramStart"/>
             <w:r>
               <w:rPr>
                 <w:rFonts w:ascii="Consolas" w:hAnsi="Consolas" w:cs="Consolas"/>
@@ -4030,6 +4447,7 @@
               </w:rPr>
               <w:t>(</w:t>
             </w:r>
+            <w:proofErr w:type="gramEnd"/>
             <w:r>
               <w:rPr>
                 <w:rFonts w:ascii="Consolas" w:hAnsi="Consolas" w:cs="Consolas"/>
@@ -4707,16 +5125,6 @@
         </w:tc>
       </w:tr>
     </w:tbl>
-    <w:p>
-      <w:pPr>
-        <w:spacing w:before="120"/>
-      </w:pPr>
-    </w:p>
-    <w:p>
-      <w:pPr>
-        <w:spacing w:before="120"/>
-      </w:pPr>
-    </w:p>
     <w:p>
       <w:pPr>
         <w:spacing w:before="120"/>
@@ -4778,6 +5186,8 @@
         </w:rPr>
         <w:t xml:space="preserve"> </w:t>
       </w:r>
+      <w:proofErr w:type="spellStart"/>
+      <w:proofErr w:type="gramStart"/>
       <w:r>
         <w:rPr>
           <w:rFonts w:ascii="Calibri" w:eastAsia="Calibri" w:hAnsi="Calibri" w:cs="Calibri"/>
@@ -4785,7 +5195,7 @@
           <w:sz w:val="21"/>
           <w:szCs w:val="21"/>
         </w:rPr>
-        <w:t xml:space="preserve">location </w:t>
+        <w:t>from</w:t>
       </w:r>
       <w:r>
         <w:rPr>
@@ -4794,7 +5204,7 @@
           <w:sz w:val="21"/>
           <w:szCs w:val="21"/>
         </w:rPr>
-        <w:t>,</w:t>
+        <w:t>location</w:t>
       </w:r>
       <w:r>
         <w:rPr>
@@ -4803,8 +5213,10 @@
           <w:sz w:val="21"/>
           <w:szCs w:val="21"/>
         </w:rPr>
-        <w:t xml:space="preserve"> </w:t>
-      </w:r>
+        <w:t>id,configid</w:t>
+      </w:r>
+      <w:proofErr w:type="spellEnd"/>
+      <w:proofErr w:type="gramEnd"/>
       <w:r>
         <w:rPr>
           <w:rFonts w:ascii="Calibri" w:eastAsia="Calibri" w:hAnsi="Calibri" w:cs="Calibri"/>
@@ -4812,9 +5224,8 @@
           <w:sz w:val="21"/>
           <w:szCs w:val="21"/>
         </w:rPr>
-        <w:t>Grid Data(</w:t>
-      </w:r>
-      <w:proofErr w:type="spellStart"/>
+        <w:t xml:space="preserve"> </w:t>
+      </w:r>
       <w:r>
         <w:rPr>
           <w:rFonts w:ascii="Calibri" w:eastAsia="Calibri" w:hAnsi="Calibri" w:cs="Calibri"/>
@@ -4822,9 +5233,8 @@
           <w:sz w:val="21"/>
           <w:szCs w:val="21"/>
         </w:rPr>
-        <w:t>rb_mntcompldet</w:t>
-      </w:r>
-      <w:proofErr w:type="spellEnd"/>
+        <w:t>,</w:t>
+      </w:r>
       <w:r>
         <w:rPr>
           <w:rFonts w:ascii="Calibri" w:eastAsia="Calibri" w:hAnsi="Calibri" w:cs="Calibri"/>
@@ -4832,7 +5242,7 @@
           <w:sz w:val="21"/>
           <w:szCs w:val="21"/>
         </w:rPr>
-        <w:t xml:space="preserve">) Refresh </w:t>
+        <w:t xml:space="preserve"> </w:t>
       </w:r>
       <w:r>
         <w:rPr>
@@ -4841,41 +5251,163 @@
           <w:sz w:val="21"/>
           <w:szCs w:val="21"/>
         </w:rPr>
+        <w:t>Grid Data(</w:t>
+      </w:r>
+      <w:proofErr w:type="spellStart"/>
+      <w:r>
+        <w:rPr>
+          <w:rFonts w:ascii="Calibri" w:eastAsia="Calibri" w:hAnsi="Calibri" w:cs="Calibri"/>
+          <w:color w:val="166534"/>
+          <w:sz w:val="21"/>
+          <w:szCs w:val="21"/>
+        </w:rPr>
+        <w:t>rb_mntcpndet</w:t>
+      </w:r>
+      <w:proofErr w:type="spellEnd"/>
+      <w:r>
+        <w:rPr>
+          <w:rFonts w:ascii="Calibri" w:eastAsia="Calibri" w:hAnsi="Calibri" w:cs="Calibri"/>
+          <w:color w:val="166534"/>
+          <w:sz w:val="21"/>
+          <w:szCs w:val="21"/>
+        </w:rPr>
+        <w:t xml:space="preserve">) Refresh </w:t>
+      </w:r>
+      <w:r>
+        <w:rPr>
+          <w:rFonts w:ascii="Calibri" w:eastAsia="Calibri" w:hAnsi="Calibri" w:cs="Calibri"/>
+          <w:color w:val="166534"/>
+          <w:sz w:val="21"/>
+          <w:szCs w:val="21"/>
+        </w:rPr>
         <w:t>and reload its options.</w:t>
       </w:r>
     </w:p>
     <w:p>
       <w:pPr>
-        <w:pStyle w:val="ListParagraph"/>
         <w:spacing w:before="40" w:after="80"/>
-        <w:ind w:left="720"/>
+        <w:ind w:left="200"/>
+        <w:rPr>
+          <w:rFonts w:ascii="Calibri" w:eastAsia="Calibri" w:hAnsi="Calibri" w:cs="Calibri"/>
+          <w:color w:val="166534"/>
+          <w:sz w:val="21"/>
+          <w:szCs w:val="21"/>
+        </w:rPr>
       </w:pPr>
     </w:p>
     <w:p>
       <w:pPr>
-        <w:spacing w:before="60"/>
+        <w:spacing w:before="40" w:after="80"/>
+        <w:ind w:left="200"/>
+        <w:rPr>
+          <w:rFonts w:ascii="Calibri" w:eastAsia="Calibri" w:hAnsi="Calibri" w:cs="Calibri"/>
+          <w:color w:val="166534"/>
+          <w:sz w:val="21"/>
+          <w:szCs w:val="21"/>
+        </w:rPr>
+      </w:pPr>
+      <w:r>
+        <w:rPr>
+          <w:rFonts w:ascii="Arial" w:eastAsia="Calibri" w:hAnsi="Arial" w:cs="Arial"/>
+          <w:b/>
+          <w:bCs/>
+          <w:color w:val="166534"/>
+          <w:sz w:val="21"/>
+          <w:szCs w:val="21"/>
+        </w:rPr>
+        <w:t>►</w:t>
+      </w:r>
+      <w:r>
         <w:rPr>
           <w:rFonts w:ascii="Calibri" w:eastAsia="Calibri" w:hAnsi="Calibri" w:cs="Calibri"/>
           <w:b/>
           <w:bCs/>
-          <w:color w:val="0F3460"/>
+          <w:color w:val="166534"/>
           <w:sz w:val="21"/>
           <w:szCs w:val="21"/>
         </w:rPr>
-      </w:pPr>
-    </w:p>
-    <w:p>
-      <w:pPr>
-        <w:spacing w:before="60"/>
+        <w:t xml:space="preserve"> </w:t>
+      </w:r>
+      <w:r>
         <w:rPr>
           <w:rFonts w:ascii="Calibri" w:eastAsia="Calibri" w:hAnsi="Calibri" w:cs="Calibri"/>
-          <w:b/>
-          <w:bCs/>
-          <w:color w:val="0F3460"/>
+          <w:color w:val="166534"/>
           <w:sz w:val="21"/>
           <w:szCs w:val="21"/>
         </w:rPr>
-      </w:pPr>
+        <w:t xml:space="preserve">When </w:t>
+      </w:r>
+      <w:proofErr w:type="spellStart"/>
+      <w:r>
+        <w:rPr>
+          <w:rFonts w:ascii="Calibri" w:eastAsia="Calibri" w:hAnsi="Calibri" w:cs="Calibri"/>
+          <w:color w:val="166534"/>
+          <w:sz w:val="21"/>
+          <w:szCs w:val="21"/>
+        </w:rPr>
+        <w:t>fromlocationid</w:t>
+      </w:r>
+      <w:proofErr w:type="spellEnd"/>
+      <w:r>
+        <w:rPr>
+          <w:rFonts w:ascii="Calibri" w:eastAsia="Calibri" w:hAnsi="Calibri" w:cs="Calibri"/>
+          <w:color w:val="166534"/>
+          <w:sz w:val="21"/>
+          <w:szCs w:val="21"/>
+        </w:rPr>
+        <w:t xml:space="preserve"> changes → clear </w:t>
+      </w:r>
+      <w:proofErr w:type="spellStart"/>
+      <w:proofErr w:type="gramStart"/>
+      <w:r>
+        <w:rPr>
+          <w:rFonts w:ascii="Calibri" w:eastAsia="Calibri" w:hAnsi="Calibri" w:cs="Calibri"/>
+          <w:color w:val="166534"/>
+          <w:sz w:val="21"/>
+          <w:szCs w:val="21"/>
+        </w:rPr>
+        <w:t>configid</w:t>
+      </w:r>
+      <w:proofErr w:type="spellEnd"/>
+      <w:r>
+        <w:rPr>
+          <w:rFonts w:ascii="Calibri" w:eastAsia="Calibri" w:hAnsi="Calibri" w:cs="Calibri"/>
+          <w:color w:val="166534"/>
+          <w:sz w:val="21"/>
+          <w:szCs w:val="21"/>
+        </w:rPr>
+        <w:t xml:space="preserve"> ,</w:t>
+      </w:r>
+      <w:proofErr w:type="gramEnd"/>
+      <w:r>
+        <w:rPr>
+          <w:rFonts w:ascii="Calibri" w:eastAsia="Calibri" w:hAnsi="Calibri" w:cs="Calibri"/>
+          <w:color w:val="166534"/>
+          <w:sz w:val="21"/>
+          <w:szCs w:val="21"/>
+        </w:rPr>
+        <w:t xml:space="preserve"> Grid Data(</w:t>
+      </w:r>
+      <w:proofErr w:type="spellStart"/>
+      <w:r>
+        <w:rPr>
+          <w:rFonts w:ascii="Calibri" w:eastAsia="Calibri" w:hAnsi="Calibri" w:cs="Calibri"/>
+          <w:color w:val="166534"/>
+          <w:sz w:val="21"/>
+          <w:szCs w:val="21"/>
+        </w:rPr>
+        <w:t>rb_mntcpndet</w:t>
+      </w:r>
+      <w:proofErr w:type="spellEnd"/>
+      <w:r>
+        <w:rPr>
+          <w:rFonts w:ascii="Calibri" w:eastAsia="Calibri" w:hAnsi="Calibri" w:cs="Calibri"/>
+          <w:color w:val="166534"/>
+          <w:sz w:val="21"/>
+          <w:szCs w:val="21"/>
+        </w:rPr>
+        <w:t>) Refresh and reload its options.</w:t>
+      </w:r>
     </w:p>
     <w:p>
       <w:pPr>
@@ -5380,7 +5912,7 @@
                 <w:sz w:val="19"/>
                 <w:szCs w:val="19"/>
               </w:rPr>
-              <w:t>rb_mntcompldet</w:t>
+              <w:t>rb_mntcpndet</w:t>
             </w:r>
             <w:proofErr w:type="spellEnd"/>
             <w:r>
@@ -5558,7 +6090,17 @@
                 <w:sz w:val="19"/>
                 <w:szCs w:val="19"/>
               </w:rPr>
-              <w:t>rb_mntcompldet</w:t>
+              <w:t>rb_</w:t>
+            </w:r>
+            <w:proofErr w:type="gramStart"/>
+            <w:r>
+              <w:rPr>
+                <w:rFonts w:ascii="Calibri" w:eastAsia="Calibri" w:hAnsi="Calibri" w:cs="Calibri"/>
+                <w:color w:val="166534"/>
+                <w:sz w:val="19"/>
+                <w:szCs w:val="19"/>
+              </w:rPr>
+              <w:t>mntcpndet</w:t>
             </w:r>
             <w:proofErr w:type="spellEnd"/>
             <w:r>
@@ -5579,6 +6121,7 @@
               </w:rPr>
               <w:t xml:space="preserve"> metadata</w:t>
             </w:r>
+            <w:proofErr w:type="gramEnd"/>
           </w:p>
         </w:tc>
       </w:tr>
@@ -5736,7 +6279,7 @@
                 <w:sz w:val="19"/>
                 <w:szCs w:val="19"/>
               </w:rPr>
-              <w:t>rb_mntcompldet</w:t>
+              <w:t>rb_mntcpndet</w:t>
             </w:r>
             <w:proofErr w:type="spellEnd"/>
             <w:r>
@@ -5965,7 +6508,7 @@
                 <w:sz w:val="19"/>
                 <w:szCs w:val="19"/>
               </w:rPr>
-              <w:t>rb_mntcompldet</w:t>
+              <w:t>rb_mntcpndet</w:t>
             </w:r>
             <w:proofErr w:type="spellEnd"/>
             <w:r>
@@ -6134,7 +6677,7 @@
                 <w:sz w:val="19"/>
                 <w:szCs w:val="19"/>
               </w:rPr>
-              <w:t>rb_mntcompldet</w:t>
+              <w:t>rb_mntcpndet</w:t>
             </w:r>
             <w:proofErr w:type="spellEnd"/>
             <w:r>
@@ -6455,7 +6998,7 @@
                 <w:sz w:val="19"/>
                 <w:szCs w:val="19"/>
               </w:rPr>
-              <w:t>rb_mntcompldet</w:t>
+              <w:t>rb_mntcpndet</w:t>
             </w:r>
             <w:proofErr w:type="spellEnd"/>
             <w:r>
@@ -6664,7 +7207,7 @@
                 <w:sz w:val="19"/>
                 <w:szCs w:val="19"/>
               </w:rPr>
-              <w:t>rb_mntcompldet</w:t>
+              <w:t>rb_mntcpndet</w:t>
             </w:r>
             <w:proofErr w:type="spellEnd"/>
             <w:r>
@@ -7571,14 +8114,25 @@
             </w:tcMar>
           </w:tcPr>
           <w:p>
-            <w:r>
-              <w:rPr>
-                <w:rFonts w:ascii="Calibri" w:eastAsia="Calibri" w:hAnsi="Calibri" w:cs="Calibri"/>
-                <w:color w:val="166534"/>
-                <w:sz w:val="19"/>
-                <w:szCs w:val="19"/>
-              </w:rPr>
-              <w:t>Table[0]: RBID + column definitions</w:t>
+            <w:proofErr w:type="gramStart"/>
+            <w:r>
+              <w:rPr>
+                <w:rFonts w:ascii="Calibri" w:eastAsia="Calibri" w:hAnsi="Calibri" w:cs="Calibri"/>
+                <w:color w:val="166534"/>
+                <w:sz w:val="19"/>
+                <w:szCs w:val="19"/>
+              </w:rPr>
+              <w:t>Table[</w:t>
+            </w:r>
+            <w:proofErr w:type="gramEnd"/>
+            <w:r>
+              <w:rPr>
+                <w:rFonts w:ascii="Calibri" w:eastAsia="Calibri" w:hAnsi="Calibri" w:cs="Calibri"/>
+                <w:color w:val="166534"/>
+                <w:sz w:val="19"/>
+                <w:szCs w:val="19"/>
+              </w:rPr>
+              <w:t>0]: RBID + column definitions</w:t>
             </w:r>
           </w:p>
         </w:tc>
@@ -7772,7 +8326,19 @@
               <w:right w:w="120" w:type="dxa"/>
             </w:tcMar>
           </w:tcPr>
-          <w:p/>
+          <w:p>
+            <w:proofErr w:type="spellStart"/>
+            <w:r>
+              <w:rPr>
+                <w:rFonts w:ascii="Consolas" w:hAnsi="Consolas" w:cs="Consolas"/>
+                <w:color w:val="000000"/>
+                <w:sz w:val="19"/>
+                <w:szCs w:val="19"/>
+              </w:rPr>
+              <w:t>fn_tbl_rb_mntcpnselonly</w:t>
+            </w:r>
+            <w:proofErr w:type="spellEnd"/>
+          </w:p>
         </w:tc>
         <w:tc>
           <w:tcPr>
@@ -7791,7 +8357,11 @@
               <w:right w:w="120" w:type="dxa"/>
             </w:tcMar>
           </w:tcPr>
-          <w:p/>
+          <w:p>
+            <w:r>
+              <w:t>2</w:t>
+            </w:r>
+          </w:p>
         </w:tc>
         <w:tc>
           <w:tcPr>
@@ -7810,7 +8380,11 @@
               <w:right w:w="120" w:type="dxa"/>
             </w:tcMar>
           </w:tcPr>
-          <w:p/>
+          <w:p>
+            <w:r>
+              <w:t>To fill data in select item popup</w:t>
+            </w:r>
+          </w:p>
         </w:tc>
         <w:tc>
           <w:tcPr>
@@ -7829,7 +8403,575 @@
               <w:right w:w="120" w:type="dxa"/>
             </w:tcMar>
           </w:tcPr>
-          <w:p/>
+          <w:p>
+            <w:pPr>
+              <w:autoSpaceDE w:val="0"/>
+              <w:autoSpaceDN w:val="0"/>
+              <w:adjustRightInd w:val="0"/>
+              <w:rPr>
+                <w:rFonts w:ascii="Consolas" w:hAnsi="Consolas" w:cs="Consolas"/>
+                <w:color w:val="000000"/>
+                <w:sz w:val="19"/>
+                <w:szCs w:val="19"/>
+              </w:rPr>
+            </w:pPr>
+            <w:r>
+              <w:rPr>
+                <w:rFonts w:ascii="Consolas" w:hAnsi="Consolas" w:cs="Consolas"/>
+                <w:color w:val="000000"/>
+                <w:sz w:val="19"/>
+                <w:szCs w:val="19"/>
+              </w:rPr>
+              <w:t xml:space="preserve">@prmcompanyid </w:t>
+            </w:r>
+            <w:r>
+              <w:rPr>
+                <w:rFonts w:ascii="Consolas" w:hAnsi="Consolas" w:cs="Consolas"/>
+                <w:color w:val="0000FF"/>
+                <w:sz w:val="19"/>
+                <w:szCs w:val="19"/>
+              </w:rPr>
+              <w:t>integer</w:t>
+            </w:r>
+            <w:r>
+              <w:rPr>
+                <w:rFonts w:ascii="Consolas" w:hAnsi="Consolas" w:cs="Consolas"/>
+                <w:color w:val="808080"/>
+                <w:sz w:val="19"/>
+                <w:szCs w:val="19"/>
+              </w:rPr>
+              <w:t>,</w:t>
+            </w:r>
+            <w:r>
+              <w:rPr>
+                <w:rFonts w:ascii="Consolas" w:hAnsi="Consolas" w:cs="Consolas"/>
+                <w:color w:val="000000"/>
+                <w:sz w:val="19"/>
+                <w:szCs w:val="19"/>
+              </w:rPr>
+              <w:t xml:space="preserve">  </w:t>
+            </w:r>
+          </w:p>
+          <w:p>
+            <w:pPr>
+              <w:autoSpaceDE w:val="0"/>
+              <w:autoSpaceDN w:val="0"/>
+              <w:adjustRightInd w:val="0"/>
+              <w:rPr>
+                <w:rFonts w:ascii="Consolas" w:hAnsi="Consolas" w:cs="Consolas"/>
+                <w:color w:val="000000"/>
+                <w:sz w:val="19"/>
+                <w:szCs w:val="19"/>
+              </w:rPr>
+            </w:pPr>
+            <w:r>
+              <w:rPr>
+                <w:rFonts w:ascii="Consolas" w:hAnsi="Consolas" w:cs="Consolas"/>
+                <w:color w:val="000000"/>
+                <w:sz w:val="19"/>
+                <w:szCs w:val="19"/>
+              </w:rPr>
+              <w:t xml:space="preserve">@prmloginid </w:t>
+            </w:r>
+            <w:r>
+              <w:rPr>
+                <w:rFonts w:ascii="Consolas" w:hAnsi="Consolas" w:cs="Consolas"/>
+                <w:color w:val="0000FF"/>
+                <w:sz w:val="19"/>
+                <w:szCs w:val="19"/>
+              </w:rPr>
+              <w:t>integer</w:t>
+            </w:r>
+            <w:r>
+              <w:rPr>
+                <w:rFonts w:ascii="Consolas" w:hAnsi="Consolas" w:cs="Consolas"/>
+                <w:color w:val="808080"/>
+                <w:sz w:val="19"/>
+                <w:szCs w:val="19"/>
+              </w:rPr>
+              <w:t>,</w:t>
+            </w:r>
+            <w:r>
+              <w:rPr>
+                <w:rFonts w:ascii="Consolas" w:hAnsi="Consolas" w:cs="Consolas"/>
+                <w:color w:val="000000"/>
+                <w:sz w:val="19"/>
+                <w:szCs w:val="19"/>
+              </w:rPr>
+              <w:t xml:space="preserve">  </w:t>
+            </w:r>
+          </w:p>
+          <w:p>
+            <w:pPr>
+              <w:autoSpaceDE w:val="0"/>
+              <w:autoSpaceDN w:val="0"/>
+              <w:adjustRightInd w:val="0"/>
+              <w:rPr>
+                <w:rFonts w:ascii="Consolas" w:hAnsi="Consolas" w:cs="Consolas"/>
+                <w:color w:val="000000"/>
+                <w:sz w:val="19"/>
+                <w:szCs w:val="19"/>
+              </w:rPr>
+            </w:pPr>
+            <w:r>
+              <w:rPr>
+                <w:rFonts w:ascii="Consolas" w:hAnsi="Consolas" w:cs="Consolas"/>
+                <w:color w:val="000000"/>
+                <w:sz w:val="19"/>
+                <w:szCs w:val="19"/>
+              </w:rPr>
+              <w:t xml:space="preserve">@prmyearid </w:t>
+            </w:r>
+            <w:r>
+              <w:rPr>
+                <w:rFonts w:ascii="Consolas" w:hAnsi="Consolas" w:cs="Consolas"/>
+                <w:color w:val="0000FF"/>
+                <w:sz w:val="19"/>
+                <w:szCs w:val="19"/>
+              </w:rPr>
+              <w:t>int</w:t>
+            </w:r>
+            <w:r>
+              <w:rPr>
+                <w:rFonts w:ascii="Consolas" w:hAnsi="Consolas" w:cs="Consolas"/>
+                <w:color w:val="808080"/>
+                <w:sz w:val="19"/>
+                <w:szCs w:val="19"/>
+              </w:rPr>
+              <w:t>,</w:t>
+            </w:r>
+            <w:r>
+              <w:rPr>
+                <w:rFonts w:ascii="Consolas" w:hAnsi="Consolas" w:cs="Consolas"/>
+                <w:color w:val="000000"/>
+                <w:sz w:val="19"/>
+                <w:szCs w:val="19"/>
+              </w:rPr>
+              <w:t xml:space="preserve">  </w:t>
+            </w:r>
+          </w:p>
+          <w:p>
+            <w:pPr>
+              <w:autoSpaceDE w:val="0"/>
+              <w:autoSpaceDN w:val="0"/>
+              <w:adjustRightInd w:val="0"/>
+              <w:rPr>
+                <w:rFonts w:ascii="Consolas" w:hAnsi="Consolas" w:cs="Consolas"/>
+                <w:color w:val="000000"/>
+                <w:sz w:val="19"/>
+                <w:szCs w:val="19"/>
+              </w:rPr>
+            </w:pPr>
+            <w:r>
+              <w:rPr>
+                <w:rFonts w:ascii="Consolas" w:hAnsi="Consolas" w:cs="Consolas"/>
+                <w:color w:val="000000"/>
+                <w:sz w:val="19"/>
+                <w:szCs w:val="19"/>
+              </w:rPr>
+              <w:t xml:space="preserve">@prmtrandate </w:t>
+            </w:r>
+            <w:r>
+              <w:rPr>
+                <w:rFonts w:ascii="Consolas" w:hAnsi="Consolas" w:cs="Consolas"/>
+                <w:color w:val="0000FF"/>
+                <w:sz w:val="19"/>
+                <w:szCs w:val="19"/>
+              </w:rPr>
+              <w:t>date</w:t>
+            </w:r>
+            <w:r>
+              <w:rPr>
+                <w:rFonts w:ascii="Consolas" w:hAnsi="Consolas" w:cs="Consolas"/>
+                <w:color w:val="808080"/>
+                <w:sz w:val="19"/>
+                <w:szCs w:val="19"/>
+              </w:rPr>
+              <w:t>,</w:t>
+            </w:r>
+            <w:r>
+              <w:rPr>
+                <w:rFonts w:ascii="Consolas" w:hAnsi="Consolas" w:cs="Consolas"/>
+                <w:color w:val="000000"/>
+                <w:sz w:val="19"/>
+                <w:szCs w:val="19"/>
+              </w:rPr>
+              <w:t xml:space="preserve">  </w:t>
+            </w:r>
+          </w:p>
+          <w:p>
+            <w:pPr>
+              <w:autoSpaceDE w:val="0"/>
+              <w:autoSpaceDN w:val="0"/>
+              <w:adjustRightInd w:val="0"/>
+              <w:rPr>
+                <w:rFonts w:ascii="Consolas" w:hAnsi="Consolas" w:cs="Consolas"/>
+                <w:color w:val="000000"/>
+                <w:sz w:val="19"/>
+                <w:szCs w:val="19"/>
+              </w:rPr>
+            </w:pPr>
+            <w:r>
+              <w:rPr>
+                <w:rFonts w:ascii="Consolas" w:hAnsi="Consolas" w:cs="Consolas"/>
+                <w:color w:val="000000"/>
+                <w:sz w:val="19"/>
+                <w:szCs w:val="19"/>
+              </w:rPr>
+              <w:t xml:space="preserve">@prmdivisionid </w:t>
+            </w:r>
+            <w:r>
+              <w:rPr>
+                <w:rFonts w:ascii="Consolas" w:hAnsi="Consolas" w:cs="Consolas"/>
+                <w:color w:val="0000FF"/>
+                <w:sz w:val="19"/>
+                <w:szCs w:val="19"/>
+              </w:rPr>
+              <w:t>integer</w:t>
+            </w:r>
+            <w:r>
+              <w:rPr>
+                <w:rFonts w:ascii="Consolas" w:hAnsi="Consolas" w:cs="Consolas"/>
+                <w:color w:val="808080"/>
+                <w:sz w:val="19"/>
+                <w:szCs w:val="19"/>
+              </w:rPr>
+              <w:t>,</w:t>
+            </w:r>
+            <w:r>
+              <w:rPr>
+                <w:rFonts w:ascii="Consolas" w:hAnsi="Consolas" w:cs="Consolas"/>
+                <w:color w:val="000000"/>
+                <w:sz w:val="19"/>
+                <w:szCs w:val="19"/>
+              </w:rPr>
+              <w:t xml:space="preserve">  </w:t>
+            </w:r>
+          </w:p>
+          <w:p>
+            <w:pPr>
+              <w:autoSpaceDE w:val="0"/>
+              <w:autoSpaceDN w:val="0"/>
+              <w:adjustRightInd w:val="0"/>
+              <w:rPr>
+                <w:rFonts w:ascii="Consolas" w:hAnsi="Consolas" w:cs="Consolas"/>
+                <w:color w:val="000000"/>
+                <w:sz w:val="19"/>
+                <w:szCs w:val="19"/>
+              </w:rPr>
+            </w:pPr>
+            <w:r>
+              <w:rPr>
+                <w:rFonts w:ascii="Consolas" w:hAnsi="Consolas" w:cs="Consolas"/>
+                <w:color w:val="000000"/>
+                <w:sz w:val="19"/>
+                <w:szCs w:val="19"/>
+              </w:rPr>
+              <w:t xml:space="preserve">@prmfromlocationid </w:t>
+            </w:r>
+            <w:r>
+              <w:rPr>
+                <w:rFonts w:ascii="Consolas" w:hAnsi="Consolas" w:cs="Consolas"/>
+                <w:color w:val="0000FF"/>
+                <w:sz w:val="19"/>
+                <w:szCs w:val="19"/>
+              </w:rPr>
+              <w:t>integer</w:t>
+            </w:r>
+            <w:r>
+              <w:rPr>
+                <w:rFonts w:ascii="Consolas" w:hAnsi="Consolas" w:cs="Consolas"/>
+                <w:color w:val="808080"/>
+                <w:sz w:val="19"/>
+                <w:szCs w:val="19"/>
+              </w:rPr>
+              <w:t>,</w:t>
+            </w:r>
+            <w:r>
+              <w:rPr>
+                <w:rFonts w:ascii="Consolas" w:hAnsi="Consolas" w:cs="Consolas"/>
+                <w:color w:val="000000"/>
+                <w:sz w:val="19"/>
+                <w:szCs w:val="19"/>
+              </w:rPr>
+              <w:t xml:space="preserve">  </w:t>
+            </w:r>
+          </w:p>
+          <w:p>
+            <w:pPr>
+              <w:autoSpaceDE w:val="0"/>
+              <w:autoSpaceDN w:val="0"/>
+              <w:adjustRightInd w:val="0"/>
+              <w:rPr>
+                <w:rFonts w:ascii="Consolas" w:hAnsi="Consolas" w:cs="Consolas"/>
+                <w:color w:val="000000"/>
+                <w:sz w:val="19"/>
+                <w:szCs w:val="19"/>
+              </w:rPr>
+            </w:pPr>
+            <w:r>
+              <w:rPr>
+                <w:rFonts w:ascii="Consolas" w:hAnsi="Consolas" w:cs="Consolas"/>
+                <w:color w:val="000000"/>
+                <w:sz w:val="19"/>
+                <w:szCs w:val="19"/>
+              </w:rPr>
+              <w:lastRenderedPageBreak/>
+              <w:t xml:space="preserve">@prmtolocationid </w:t>
+            </w:r>
+            <w:r>
+              <w:rPr>
+                <w:rFonts w:ascii="Consolas" w:hAnsi="Consolas" w:cs="Consolas"/>
+                <w:color w:val="0000FF"/>
+                <w:sz w:val="19"/>
+                <w:szCs w:val="19"/>
+              </w:rPr>
+              <w:t>integer</w:t>
+            </w:r>
+            <w:r>
+              <w:rPr>
+                <w:rFonts w:ascii="Consolas" w:hAnsi="Consolas" w:cs="Consolas"/>
+                <w:color w:val="808080"/>
+                <w:sz w:val="19"/>
+                <w:szCs w:val="19"/>
+              </w:rPr>
+              <w:t>,</w:t>
+            </w:r>
+            <w:r>
+              <w:rPr>
+                <w:rFonts w:ascii="Consolas" w:hAnsi="Consolas" w:cs="Consolas"/>
+                <w:color w:val="000000"/>
+                <w:sz w:val="19"/>
+                <w:szCs w:val="19"/>
+              </w:rPr>
+              <w:t xml:space="preserve">  </w:t>
+            </w:r>
+          </w:p>
+          <w:p>
+            <w:pPr>
+              <w:autoSpaceDE w:val="0"/>
+              <w:autoSpaceDN w:val="0"/>
+              <w:adjustRightInd w:val="0"/>
+              <w:rPr>
+                <w:rFonts w:ascii="Consolas" w:hAnsi="Consolas" w:cs="Consolas"/>
+                <w:color w:val="000000"/>
+                <w:sz w:val="19"/>
+                <w:szCs w:val="19"/>
+              </w:rPr>
+            </w:pPr>
+            <w:r>
+              <w:rPr>
+                <w:rFonts w:ascii="Consolas" w:hAnsi="Consolas" w:cs="Consolas"/>
+                <w:color w:val="000000"/>
+                <w:sz w:val="19"/>
+                <w:szCs w:val="19"/>
+              </w:rPr>
+              <w:t xml:space="preserve">@prmfromdeptid </w:t>
+            </w:r>
+            <w:r>
+              <w:rPr>
+                <w:rFonts w:ascii="Consolas" w:hAnsi="Consolas" w:cs="Consolas"/>
+                <w:color w:val="0000FF"/>
+                <w:sz w:val="19"/>
+                <w:szCs w:val="19"/>
+              </w:rPr>
+              <w:t>integer</w:t>
+            </w:r>
+            <w:r>
+              <w:rPr>
+                <w:rFonts w:ascii="Consolas" w:hAnsi="Consolas" w:cs="Consolas"/>
+                <w:color w:val="808080"/>
+                <w:sz w:val="19"/>
+                <w:szCs w:val="19"/>
+              </w:rPr>
+              <w:t>,</w:t>
+            </w:r>
+            <w:r>
+              <w:rPr>
+                <w:rFonts w:ascii="Consolas" w:hAnsi="Consolas" w:cs="Consolas"/>
+                <w:color w:val="000000"/>
+                <w:sz w:val="19"/>
+                <w:szCs w:val="19"/>
+              </w:rPr>
+              <w:t xml:space="preserve">  </w:t>
+            </w:r>
+          </w:p>
+          <w:p>
+            <w:pPr>
+              <w:autoSpaceDE w:val="0"/>
+              <w:autoSpaceDN w:val="0"/>
+              <w:adjustRightInd w:val="0"/>
+              <w:rPr>
+                <w:rFonts w:ascii="Consolas" w:hAnsi="Consolas" w:cs="Consolas"/>
+                <w:color w:val="000000"/>
+                <w:sz w:val="19"/>
+                <w:szCs w:val="19"/>
+              </w:rPr>
+            </w:pPr>
+            <w:r>
+              <w:rPr>
+                <w:rFonts w:ascii="Consolas" w:hAnsi="Consolas" w:cs="Consolas"/>
+                <w:color w:val="000000"/>
+                <w:sz w:val="19"/>
+                <w:szCs w:val="19"/>
+              </w:rPr>
+              <w:t xml:space="preserve">@prmtodeptid </w:t>
+            </w:r>
+            <w:r>
+              <w:rPr>
+                <w:rFonts w:ascii="Consolas" w:hAnsi="Consolas" w:cs="Consolas"/>
+                <w:color w:val="0000FF"/>
+                <w:sz w:val="19"/>
+                <w:szCs w:val="19"/>
+              </w:rPr>
+              <w:t>integer</w:t>
+            </w:r>
+            <w:r>
+              <w:rPr>
+                <w:rFonts w:ascii="Consolas" w:hAnsi="Consolas" w:cs="Consolas"/>
+                <w:color w:val="808080"/>
+                <w:sz w:val="19"/>
+                <w:szCs w:val="19"/>
+              </w:rPr>
+              <w:t>,</w:t>
+            </w:r>
+            <w:r>
+              <w:rPr>
+                <w:rFonts w:ascii="Consolas" w:hAnsi="Consolas" w:cs="Consolas"/>
+                <w:color w:val="000000"/>
+                <w:sz w:val="19"/>
+                <w:szCs w:val="19"/>
+              </w:rPr>
+              <w:t xml:space="preserve">  </w:t>
+            </w:r>
+          </w:p>
+          <w:p>
+            <w:pPr>
+              <w:autoSpaceDE w:val="0"/>
+              <w:autoSpaceDN w:val="0"/>
+              <w:adjustRightInd w:val="0"/>
+              <w:rPr>
+                <w:rFonts w:ascii="Consolas" w:hAnsi="Consolas" w:cs="Consolas"/>
+                <w:color w:val="000000"/>
+                <w:sz w:val="19"/>
+                <w:szCs w:val="19"/>
+              </w:rPr>
+            </w:pPr>
+            <w:r>
+              <w:rPr>
+                <w:rFonts w:ascii="Consolas" w:hAnsi="Consolas" w:cs="Consolas"/>
+                <w:color w:val="000000"/>
+                <w:sz w:val="19"/>
+                <w:szCs w:val="19"/>
+              </w:rPr>
+              <w:t xml:space="preserve">@prmservicetypeid </w:t>
+            </w:r>
+            <w:r>
+              <w:rPr>
+                <w:rFonts w:ascii="Consolas" w:hAnsi="Consolas" w:cs="Consolas"/>
+                <w:color w:val="0000FF"/>
+                <w:sz w:val="19"/>
+                <w:szCs w:val="19"/>
+              </w:rPr>
+              <w:t>integer</w:t>
+            </w:r>
+            <w:r>
+              <w:rPr>
+                <w:rFonts w:ascii="Consolas" w:hAnsi="Consolas" w:cs="Consolas"/>
+                <w:color w:val="808080"/>
+                <w:sz w:val="19"/>
+                <w:szCs w:val="19"/>
+              </w:rPr>
+              <w:t>,</w:t>
+            </w:r>
+            <w:r>
+              <w:rPr>
+                <w:rFonts w:ascii="Consolas" w:hAnsi="Consolas" w:cs="Consolas"/>
+                <w:color w:val="000000"/>
+                <w:sz w:val="19"/>
+                <w:szCs w:val="19"/>
+              </w:rPr>
+              <w:t xml:space="preserve">  </w:t>
+            </w:r>
+          </w:p>
+          <w:p>
+            <w:pPr>
+              <w:autoSpaceDE w:val="0"/>
+              <w:autoSpaceDN w:val="0"/>
+              <w:adjustRightInd w:val="0"/>
+              <w:rPr>
+                <w:rFonts w:ascii="Consolas" w:hAnsi="Consolas" w:cs="Consolas"/>
+                <w:color w:val="000000"/>
+                <w:sz w:val="19"/>
+                <w:szCs w:val="19"/>
+              </w:rPr>
+            </w:pPr>
+            <w:r>
+              <w:rPr>
+                <w:rFonts w:ascii="Consolas" w:hAnsi="Consolas" w:cs="Consolas"/>
+                <w:color w:val="000000"/>
+                <w:sz w:val="19"/>
+                <w:szCs w:val="19"/>
+              </w:rPr>
+              <w:t xml:space="preserve">@prmvendorid </w:t>
+            </w:r>
+            <w:r>
+              <w:rPr>
+                <w:rFonts w:ascii="Consolas" w:hAnsi="Consolas" w:cs="Consolas"/>
+                <w:color w:val="0000FF"/>
+                <w:sz w:val="19"/>
+                <w:szCs w:val="19"/>
+              </w:rPr>
+              <w:t>integer</w:t>
+            </w:r>
+            <w:r>
+              <w:rPr>
+                <w:rFonts w:ascii="Consolas" w:hAnsi="Consolas" w:cs="Consolas"/>
+                <w:color w:val="808080"/>
+                <w:sz w:val="19"/>
+                <w:szCs w:val="19"/>
+              </w:rPr>
+              <w:t>,</w:t>
+            </w:r>
+            <w:r>
+              <w:rPr>
+                <w:rFonts w:ascii="Consolas" w:hAnsi="Consolas" w:cs="Consolas"/>
+                <w:color w:val="000000"/>
+                <w:sz w:val="19"/>
+                <w:szCs w:val="19"/>
+              </w:rPr>
+              <w:t xml:space="preserve">  </w:t>
+            </w:r>
+          </w:p>
+          <w:p>
+            <w:r>
+              <w:rPr>
+                <w:rFonts w:ascii="Consolas" w:hAnsi="Consolas" w:cs="Consolas"/>
+                <w:color w:val="000000"/>
+                <w:sz w:val="19"/>
+                <w:szCs w:val="19"/>
+              </w:rPr>
+              <w:t xml:space="preserve">@prmconfigid </w:t>
+            </w:r>
+            <w:r>
+              <w:rPr>
+                <w:rFonts w:ascii="Consolas" w:hAnsi="Consolas" w:cs="Consolas"/>
+                <w:color w:val="0000FF"/>
+                <w:sz w:val="19"/>
+                <w:szCs w:val="19"/>
+              </w:rPr>
+              <w:t>integer</w:t>
+            </w:r>
+            <w:r>
+              <w:rPr>
+                <w:rFonts w:ascii="Consolas" w:hAnsi="Consolas" w:cs="Consolas"/>
+                <w:color w:val="000000"/>
+                <w:sz w:val="19"/>
+                <w:szCs w:val="19"/>
+              </w:rPr>
+              <w:t xml:space="preserve">  </w:t>
+            </w:r>
+          </w:p>
         </w:tc>
         <w:tc>
           <w:tcPr>
@@ -8764,7 +9906,7 @@
                 <w:sz w:val="19"/>
                 <w:szCs w:val="19"/>
               </w:rPr>
-              <w:t>rb_mntcomplmst</w:t>
+              <w:t>rb_mntcpnmst</w:t>
             </w:r>
             <w:proofErr w:type="spellEnd"/>
           </w:p>
@@ -8858,7 +10000,7 @@
                 <w:sz w:val="19"/>
                 <w:szCs w:val="19"/>
               </w:rPr>
-              <w:t>rb_mntcompldet</w:t>
+              <w:t>rb_mntcpndet</w:t>
             </w:r>
             <w:proofErr w:type="spellEnd"/>
           </w:p>
@@ -8890,6 +10032,824 @@
               </w:rPr>
               <w:t>Load Item grid in form</w:t>
             </w:r>
+          </w:p>
+        </w:tc>
+      </w:tr>
+      <w:tr>
+        <w:trPr>
+          <w:trHeight w:val="454"/>
+        </w:trPr>
+        <w:tc>
+          <w:tcPr>
+            <w:tcW w:w="2053" w:type="pct"/>
+            <w:tcBorders>
+              <w:top w:val="single" w:sz="4" w:space="0" w:color="CBD5E1"/>
+              <w:left w:val="single" w:sz="4" w:space="0" w:color="CBD5E1"/>
+              <w:bottom w:val="single" w:sz="4" w:space="0" w:color="CBD5E1"/>
+              <w:right w:val="single" w:sz="4" w:space="0" w:color="CBD5E1"/>
+            </w:tcBorders>
+            <w:shd w:val="clear" w:color="auto" w:fill="F0FDF4"/>
+            <w:tcMar>
+              <w:top w:w="80" w:type="dxa"/>
+              <w:left w:w="120" w:type="dxa"/>
+              <w:bottom w:w="80" w:type="dxa"/>
+              <w:right w:w="120" w:type="dxa"/>
+            </w:tcMar>
+          </w:tcPr>
+          <w:p>
+            <w:pPr>
+              <w:rPr>
+                <w:rFonts w:ascii="Calibri" w:eastAsia="Calibri" w:hAnsi="Calibri" w:cs="Calibri"/>
+                <w:color w:val="166534"/>
+                <w:sz w:val="19"/>
+                <w:szCs w:val="19"/>
+              </w:rPr>
+            </w:pPr>
+            <w:r>
+              <w:rPr>
+                <w:rFonts w:ascii="Calibri" w:eastAsia="Calibri" w:hAnsi="Calibri" w:cs="Calibri"/>
+                <w:color w:val="166534"/>
+                <w:sz w:val="19"/>
+                <w:szCs w:val="19"/>
+              </w:rPr>
+              <w:t>Item Only</w:t>
+            </w:r>
+          </w:p>
+        </w:tc>
+        <w:tc>
+          <w:tcPr>
+            <w:tcW w:w="1389" w:type="pct"/>
+            <w:tcBorders>
+              <w:top w:val="single" w:sz="4" w:space="0" w:color="CBD5E1"/>
+              <w:left w:val="single" w:sz="4" w:space="0" w:color="CBD5E1"/>
+              <w:bottom w:val="single" w:sz="4" w:space="0" w:color="CBD5E1"/>
+              <w:right w:val="single" w:sz="4" w:space="0" w:color="CBD5E1"/>
+            </w:tcBorders>
+            <w:shd w:val="clear" w:color="auto" w:fill="F0FDF4"/>
+            <w:tcMar>
+              <w:top w:w="80" w:type="dxa"/>
+              <w:left w:w="120" w:type="dxa"/>
+              <w:bottom w:w="80" w:type="dxa"/>
+              <w:right w:w="120" w:type="dxa"/>
+            </w:tcMar>
+          </w:tcPr>
+          <w:p>
+            <w:pPr>
+              <w:rPr>
+                <w:rFonts w:ascii="Calibri" w:eastAsia="Calibri" w:hAnsi="Calibri" w:cs="Calibri"/>
+                <w:color w:val="166534"/>
+                <w:sz w:val="19"/>
+                <w:szCs w:val="19"/>
+              </w:rPr>
+            </w:pPr>
+            <w:proofErr w:type="spellStart"/>
+            <w:r>
+              <w:rPr>
+                <w:rFonts w:ascii="Calibri" w:eastAsia="Calibri" w:hAnsi="Calibri" w:cs="Calibri"/>
+                <w:color w:val="166534"/>
+                <w:sz w:val="19"/>
+                <w:szCs w:val="19"/>
+              </w:rPr>
+              <w:t>rb_mntcpnselonly</w:t>
+            </w:r>
+            <w:proofErr w:type="spellEnd"/>
+          </w:p>
+        </w:tc>
+        <w:tc>
+          <w:tcPr>
+            <w:tcW w:w="1558" w:type="pct"/>
+            <w:tcBorders>
+              <w:top w:val="single" w:sz="4" w:space="0" w:color="CBD5E1"/>
+              <w:left w:val="single" w:sz="4" w:space="0" w:color="CBD5E1"/>
+              <w:bottom w:val="single" w:sz="4" w:space="0" w:color="CBD5E1"/>
+              <w:right w:val="single" w:sz="4" w:space="0" w:color="CBD5E1"/>
+            </w:tcBorders>
+            <w:shd w:val="clear" w:color="auto" w:fill="F0FDF4"/>
+            <w:tcMar>
+              <w:top w:w="80" w:type="dxa"/>
+              <w:left w:w="120" w:type="dxa"/>
+              <w:bottom w:w="80" w:type="dxa"/>
+              <w:right w:w="120" w:type="dxa"/>
+            </w:tcMar>
+          </w:tcPr>
+          <w:p>
+            <w:pPr>
+              <w:rPr>
+                <w:rFonts w:ascii="Calibri" w:eastAsia="Calibri" w:hAnsi="Calibri" w:cs="Calibri"/>
+                <w:color w:val="166534"/>
+                <w:sz w:val="19"/>
+                <w:szCs w:val="19"/>
+              </w:rPr>
+            </w:pPr>
+            <w:r>
+              <w:rPr>
+                <w:rFonts w:ascii="Calibri" w:eastAsia="Calibri" w:hAnsi="Calibri" w:cs="Calibri"/>
+                <w:color w:val="166534"/>
+                <w:sz w:val="19"/>
+                <w:szCs w:val="19"/>
+              </w:rPr>
+              <w:t>To load Asset Item selection popup RB data</w:t>
+            </w:r>
+          </w:p>
+        </w:tc>
+      </w:tr>
+      <w:tr>
+        <w:trPr>
+          <w:trHeight w:val="454"/>
+        </w:trPr>
+        <w:tc>
+          <w:tcPr>
+            <w:tcW w:w="2053" w:type="pct"/>
+            <w:tcBorders>
+              <w:top w:val="single" w:sz="4" w:space="0" w:color="CBD5E1"/>
+              <w:left w:val="single" w:sz="4" w:space="0" w:color="CBD5E1"/>
+              <w:bottom w:val="single" w:sz="4" w:space="0" w:color="CBD5E1"/>
+              <w:right w:val="single" w:sz="4" w:space="0" w:color="CBD5E1"/>
+            </w:tcBorders>
+            <w:shd w:val="clear" w:color="auto" w:fill="F0FDF4"/>
+            <w:tcMar>
+              <w:top w:w="80" w:type="dxa"/>
+              <w:left w:w="120" w:type="dxa"/>
+              <w:bottom w:w="80" w:type="dxa"/>
+              <w:right w:w="120" w:type="dxa"/>
+            </w:tcMar>
+          </w:tcPr>
+          <w:p>
+            <w:pPr>
+              <w:rPr>
+                <w:rFonts w:ascii="Calibri" w:eastAsia="Calibri" w:hAnsi="Calibri" w:cs="Calibri"/>
+                <w:color w:val="166534"/>
+                <w:sz w:val="19"/>
+                <w:szCs w:val="19"/>
+              </w:rPr>
+            </w:pPr>
+            <w:r>
+              <w:rPr>
+                <w:rFonts w:ascii="Calibri" w:eastAsia="Calibri" w:hAnsi="Calibri" w:cs="Calibri"/>
+                <w:color w:val="166534"/>
+                <w:sz w:val="19"/>
+                <w:szCs w:val="19"/>
+              </w:rPr>
+              <w:t>Item Selection popup</w:t>
+            </w:r>
+          </w:p>
+        </w:tc>
+        <w:tc>
+          <w:tcPr>
+            <w:tcW w:w="1389" w:type="pct"/>
+            <w:tcBorders>
+              <w:top w:val="single" w:sz="4" w:space="0" w:color="CBD5E1"/>
+              <w:left w:val="single" w:sz="4" w:space="0" w:color="CBD5E1"/>
+              <w:bottom w:val="single" w:sz="4" w:space="0" w:color="CBD5E1"/>
+              <w:right w:val="single" w:sz="4" w:space="0" w:color="CBD5E1"/>
+            </w:tcBorders>
+            <w:shd w:val="clear" w:color="auto" w:fill="F0FDF4"/>
+            <w:tcMar>
+              <w:top w:w="80" w:type="dxa"/>
+              <w:left w:w="120" w:type="dxa"/>
+              <w:bottom w:w="80" w:type="dxa"/>
+              <w:right w:w="120" w:type="dxa"/>
+            </w:tcMar>
+          </w:tcPr>
+          <w:p>
+            <w:pPr>
+              <w:autoSpaceDE w:val="0"/>
+              <w:autoSpaceDN w:val="0"/>
+              <w:adjustRightInd w:val="0"/>
+              <w:rPr>
+                <w:rFonts w:ascii="Calibri" w:eastAsia="Calibri" w:hAnsi="Calibri" w:cs="Calibri"/>
+                <w:color w:val="166534"/>
+                <w:sz w:val="19"/>
+                <w:szCs w:val="19"/>
+              </w:rPr>
+            </w:pPr>
+            <w:proofErr w:type="spellStart"/>
+            <w:r>
+              <w:rPr>
+                <w:rFonts w:ascii="Consolas" w:hAnsi="Consolas" w:cs="Consolas"/>
+                <w:color w:val="000000"/>
+                <w:sz w:val="19"/>
+                <w:szCs w:val="19"/>
+              </w:rPr>
+              <w:t>fn_tbl_rb_mntcpnselonly</w:t>
+            </w:r>
+            <w:proofErr w:type="spellEnd"/>
+          </w:p>
+          <w:p>
+            <w:pPr>
+              <w:autoSpaceDE w:val="0"/>
+              <w:autoSpaceDN w:val="0"/>
+              <w:adjustRightInd w:val="0"/>
+              <w:rPr>
+                <w:rFonts w:ascii="Consolas" w:hAnsi="Consolas" w:cs="Consolas"/>
+                <w:color w:val="000000"/>
+                <w:sz w:val="19"/>
+                <w:szCs w:val="19"/>
+              </w:rPr>
+            </w:pPr>
+            <w:r>
+              <w:rPr>
+                <w:rFonts w:ascii="Calibri" w:eastAsia="Calibri" w:hAnsi="Calibri" w:cs="Calibri"/>
+                <w:color w:val="166534"/>
+                <w:sz w:val="19"/>
+                <w:szCs w:val="19"/>
+              </w:rPr>
+              <w:t>(</w:t>
+            </w:r>
+            <w:r>
+              <w:rPr>
+                <w:rFonts w:ascii="Consolas" w:hAnsi="Consolas" w:cs="Consolas"/>
+                <w:color w:val="000000"/>
+                <w:sz w:val="19"/>
+                <w:szCs w:val="19"/>
+              </w:rPr>
+              <w:t xml:space="preserve">@prmcompanyid </w:t>
+            </w:r>
+            <w:r>
+              <w:rPr>
+                <w:rFonts w:ascii="Consolas" w:hAnsi="Consolas" w:cs="Consolas"/>
+                <w:color w:val="0000FF"/>
+                <w:sz w:val="19"/>
+                <w:szCs w:val="19"/>
+              </w:rPr>
+              <w:t>integer</w:t>
+            </w:r>
+            <w:r>
+              <w:rPr>
+                <w:rFonts w:ascii="Consolas" w:hAnsi="Consolas" w:cs="Consolas"/>
+                <w:color w:val="808080"/>
+                <w:sz w:val="19"/>
+                <w:szCs w:val="19"/>
+              </w:rPr>
+              <w:t>,</w:t>
+            </w:r>
+            <w:r>
+              <w:rPr>
+                <w:rFonts w:ascii="Consolas" w:hAnsi="Consolas" w:cs="Consolas"/>
+                <w:color w:val="000000"/>
+                <w:sz w:val="19"/>
+                <w:szCs w:val="19"/>
+              </w:rPr>
+              <w:t xml:space="preserve">  </w:t>
+            </w:r>
+          </w:p>
+          <w:p>
+            <w:pPr>
+              <w:autoSpaceDE w:val="0"/>
+              <w:autoSpaceDN w:val="0"/>
+              <w:adjustRightInd w:val="0"/>
+              <w:rPr>
+                <w:rFonts w:ascii="Consolas" w:hAnsi="Consolas" w:cs="Consolas"/>
+                <w:color w:val="000000"/>
+                <w:sz w:val="19"/>
+                <w:szCs w:val="19"/>
+              </w:rPr>
+            </w:pPr>
+            <w:r>
+              <w:rPr>
+                <w:rFonts w:ascii="Consolas" w:hAnsi="Consolas" w:cs="Consolas"/>
+                <w:color w:val="000000"/>
+                <w:sz w:val="19"/>
+                <w:szCs w:val="19"/>
+              </w:rPr>
+              <w:t xml:space="preserve">@prmloginid </w:t>
+            </w:r>
+            <w:r>
+              <w:rPr>
+                <w:rFonts w:ascii="Consolas" w:hAnsi="Consolas" w:cs="Consolas"/>
+                <w:color w:val="0000FF"/>
+                <w:sz w:val="19"/>
+                <w:szCs w:val="19"/>
+              </w:rPr>
+              <w:t>integer</w:t>
+            </w:r>
+            <w:r>
+              <w:rPr>
+                <w:rFonts w:ascii="Consolas" w:hAnsi="Consolas" w:cs="Consolas"/>
+                <w:color w:val="808080"/>
+                <w:sz w:val="19"/>
+                <w:szCs w:val="19"/>
+              </w:rPr>
+              <w:t>,</w:t>
+            </w:r>
+            <w:r>
+              <w:rPr>
+                <w:rFonts w:ascii="Consolas" w:hAnsi="Consolas" w:cs="Consolas"/>
+                <w:color w:val="000000"/>
+                <w:sz w:val="19"/>
+                <w:szCs w:val="19"/>
+              </w:rPr>
+              <w:t xml:space="preserve">  </w:t>
+            </w:r>
+          </w:p>
+          <w:p>
+            <w:pPr>
+              <w:autoSpaceDE w:val="0"/>
+              <w:autoSpaceDN w:val="0"/>
+              <w:adjustRightInd w:val="0"/>
+              <w:rPr>
+                <w:rFonts w:ascii="Consolas" w:hAnsi="Consolas" w:cs="Consolas"/>
+                <w:color w:val="000000"/>
+                <w:sz w:val="19"/>
+                <w:szCs w:val="19"/>
+              </w:rPr>
+            </w:pPr>
+            <w:r>
+              <w:rPr>
+                <w:rFonts w:ascii="Consolas" w:hAnsi="Consolas" w:cs="Consolas"/>
+                <w:color w:val="000000"/>
+                <w:sz w:val="19"/>
+                <w:szCs w:val="19"/>
+              </w:rPr>
+              <w:t xml:space="preserve">@prmyearid </w:t>
+            </w:r>
+            <w:r>
+              <w:rPr>
+                <w:rFonts w:ascii="Consolas" w:hAnsi="Consolas" w:cs="Consolas"/>
+                <w:color w:val="0000FF"/>
+                <w:sz w:val="19"/>
+                <w:szCs w:val="19"/>
+              </w:rPr>
+              <w:t>int</w:t>
+            </w:r>
+            <w:r>
+              <w:rPr>
+                <w:rFonts w:ascii="Consolas" w:hAnsi="Consolas" w:cs="Consolas"/>
+                <w:color w:val="808080"/>
+                <w:sz w:val="19"/>
+                <w:szCs w:val="19"/>
+              </w:rPr>
+              <w:t>,</w:t>
+            </w:r>
+            <w:r>
+              <w:rPr>
+                <w:rFonts w:ascii="Consolas" w:hAnsi="Consolas" w:cs="Consolas"/>
+                <w:color w:val="000000"/>
+                <w:sz w:val="19"/>
+                <w:szCs w:val="19"/>
+              </w:rPr>
+              <w:t xml:space="preserve">  </w:t>
+            </w:r>
+          </w:p>
+          <w:p>
+            <w:pPr>
+              <w:autoSpaceDE w:val="0"/>
+              <w:autoSpaceDN w:val="0"/>
+              <w:adjustRightInd w:val="0"/>
+              <w:rPr>
+                <w:rFonts w:ascii="Consolas" w:hAnsi="Consolas" w:cs="Consolas"/>
+                <w:color w:val="000000"/>
+                <w:sz w:val="19"/>
+                <w:szCs w:val="19"/>
+              </w:rPr>
+            </w:pPr>
+            <w:r>
+              <w:rPr>
+                <w:rFonts w:ascii="Consolas" w:hAnsi="Consolas" w:cs="Consolas"/>
+                <w:color w:val="000000"/>
+                <w:sz w:val="19"/>
+                <w:szCs w:val="19"/>
+              </w:rPr>
+              <w:t xml:space="preserve">@prmtrandate </w:t>
+            </w:r>
+            <w:r>
+              <w:rPr>
+                <w:rFonts w:ascii="Consolas" w:hAnsi="Consolas" w:cs="Consolas"/>
+                <w:color w:val="0000FF"/>
+                <w:sz w:val="19"/>
+                <w:szCs w:val="19"/>
+              </w:rPr>
+              <w:t>date</w:t>
+            </w:r>
+            <w:r>
+              <w:rPr>
+                <w:rFonts w:ascii="Consolas" w:hAnsi="Consolas" w:cs="Consolas"/>
+                <w:color w:val="808080"/>
+                <w:sz w:val="19"/>
+                <w:szCs w:val="19"/>
+              </w:rPr>
+              <w:t>,</w:t>
+            </w:r>
+            <w:r>
+              <w:rPr>
+                <w:rFonts w:ascii="Consolas" w:hAnsi="Consolas" w:cs="Consolas"/>
+                <w:color w:val="000000"/>
+                <w:sz w:val="19"/>
+                <w:szCs w:val="19"/>
+              </w:rPr>
+              <w:t xml:space="preserve">  </w:t>
+            </w:r>
+          </w:p>
+          <w:p>
+            <w:pPr>
+              <w:autoSpaceDE w:val="0"/>
+              <w:autoSpaceDN w:val="0"/>
+              <w:adjustRightInd w:val="0"/>
+              <w:rPr>
+                <w:rFonts w:ascii="Consolas" w:hAnsi="Consolas" w:cs="Consolas"/>
+                <w:color w:val="000000"/>
+                <w:sz w:val="19"/>
+                <w:szCs w:val="19"/>
+              </w:rPr>
+            </w:pPr>
+            <w:r>
+              <w:rPr>
+                <w:rFonts w:ascii="Consolas" w:hAnsi="Consolas" w:cs="Consolas"/>
+                <w:color w:val="000000"/>
+                <w:sz w:val="19"/>
+                <w:szCs w:val="19"/>
+              </w:rPr>
+              <w:t xml:space="preserve">@prmdivisionid </w:t>
+            </w:r>
+            <w:r>
+              <w:rPr>
+                <w:rFonts w:ascii="Consolas" w:hAnsi="Consolas" w:cs="Consolas"/>
+                <w:color w:val="0000FF"/>
+                <w:sz w:val="19"/>
+                <w:szCs w:val="19"/>
+              </w:rPr>
+              <w:t>integer</w:t>
+            </w:r>
+            <w:r>
+              <w:rPr>
+                <w:rFonts w:ascii="Consolas" w:hAnsi="Consolas" w:cs="Consolas"/>
+                <w:color w:val="808080"/>
+                <w:sz w:val="19"/>
+                <w:szCs w:val="19"/>
+              </w:rPr>
+              <w:t>,</w:t>
+            </w:r>
+            <w:r>
+              <w:rPr>
+                <w:rFonts w:ascii="Consolas" w:hAnsi="Consolas" w:cs="Consolas"/>
+                <w:color w:val="000000"/>
+                <w:sz w:val="19"/>
+                <w:szCs w:val="19"/>
+              </w:rPr>
+              <w:t xml:space="preserve">  </w:t>
+            </w:r>
+          </w:p>
+          <w:p>
+            <w:pPr>
+              <w:autoSpaceDE w:val="0"/>
+              <w:autoSpaceDN w:val="0"/>
+              <w:adjustRightInd w:val="0"/>
+              <w:rPr>
+                <w:rFonts w:ascii="Consolas" w:hAnsi="Consolas" w:cs="Consolas"/>
+                <w:color w:val="000000"/>
+                <w:sz w:val="19"/>
+                <w:szCs w:val="19"/>
+              </w:rPr>
+            </w:pPr>
+            <w:r>
+              <w:rPr>
+                <w:rFonts w:ascii="Consolas" w:hAnsi="Consolas" w:cs="Consolas"/>
+                <w:color w:val="000000"/>
+                <w:sz w:val="19"/>
+                <w:szCs w:val="19"/>
+              </w:rPr>
+              <w:t xml:space="preserve">@prmfromlocationid </w:t>
+            </w:r>
+            <w:r>
+              <w:rPr>
+                <w:rFonts w:ascii="Consolas" w:hAnsi="Consolas" w:cs="Consolas"/>
+                <w:color w:val="0000FF"/>
+                <w:sz w:val="19"/>
+                <w:szCs w:val="19"/>
+              </w:rPr>
+              <w:t>integer</w:t>
+            </w:r>
+            <w:r>
+              <w:rPr>
+                <w:rFonts w:ascii="Consolas" w:hAnsi="Consolas" w:cs="Consolas"/>
+                <w:color w:val="808080"/>
+                <w:sz w:val="19"/>
+                <w:szCs w:val="19"/>
+              </w:rPr>
+              <w:t>,</w:t>
+            </w:r>
+            <w:r>
+              <w:rPr>
+                <w:rFonts w:ascii="Consolas" w:hAnsi="Consolas" w:cs="Consolas"/>
+                <w:color w:val="000000"/>
+                <w:sz w:val="19"/>
+                <w:szCs w:val="19"/>
+              </w:rPr>
+              <w:t xml:space="preserve">  </w:t>
+            </w:r>
+          </w:p>
+          <w:p>
+            <w:pPr>
+              <w:autoSpaceDE w:val="0"/>
+              <w:autoSpaceDN w:val="0"/>
+              <w:adjustRightInd w:val="0"/>
+              <w:rPr>
+                <w:rFonts w:ascii="Consolas" w:hAnsi="Consolas" w:cs="Consolas"/>
+                <w:color w:val="000000"/>
+                <w:sz w:val="19"/>
+                <w:szCs w:val="19"/>
+              </w:rPr>
+            </w:pPr>
+            <w:r>
+              <w:rPr>
+                <w:rFonts w:ascii="Consolas" w:hAnsi="Consolas" w:cs="Consolas"/>
+                <w:color w:val="000000"/>
+                <w:sz w:val="19"/>
+                <w:szCs w:val="19"/>
+              </w:rPr>
+              <w:t xml:space="preserve">@prmtolocationid </w:t>
+            </w:r>
+            <w:r>
+              <w:rPr>
+                <w:rFonts w:ascii="Consolas" w:hAnsi="Consolas" w:cs="Consolas"/>
+                <w:color w:val="0000FF"/>
+                <w:sz w:val="19"/>
+                <w:szCs w:val="19"/>
+              </w:rPr>
+              <w:t>integer</w:t>
+            </w:r>
+            <w:r>
+              <w:rPr>
+                <w:rFonts w:ascii="Consolas" w:hAnsi="Consolas" w:cs="Consolas"/>
+                <w:color w:val="808080"/>
+                <w:sz w:val="19"/>
+                <w:szCs w:val="19"/>
+              </w:rPr>
+              <w:t>,</w:t>
+            </w:r>
+            <w:r>
+              <w:rPr>
+                <w:rFonts w:ascii="Consolas" w:hAnsi="Consolas" w:cs="Consolas"/>
+                <w:color w:val="000000"/>
+                <w:sz w:val="19"/>
+                <w:szCs w:val="19"/>
+              </w:rPr>
+              <w:t xml:space="preserve">  </w:t>
+            </w:r>
+          </w:p>
+          <w:p>
+            <w:pPr>
+              <w:autoSpaceDE w:val="0"/>
+              <w:autoSpaceDN w:val="0"/>
+              <w:adjustRightInd w:val="0"/>
+              <w:rPr>
+                <w:rFonts w:ascii="Consolas" w:hAnsi="Consolas" w:cs="Consolas"/>
+                <w:color w:val="000000"/>
+                <w:sz w:val="19"/>
+                <w:szCs w:val="19"/>
+              </w:rPr>
+            </w:pPr>
+            <w:r>
+              <w:rPr>
+                <w:rFonts w:ascii="Consolas" w:hAnsi="Consolas" w:cs="Consolas"/>
+                <w:color w:val="000000"/>
+                <w:sz w:val="19"/>
+                <w:szCs w:val="19"/>
+              </w:rPr>
+              <w:t xml:space="preserve">@prmfromdeptid </w:t>
+            </w:r>
+            <w:r>
+              <w:rPr>
+                <w:rFonts w:ascii="Consolas" w:hAnsi="Consolas" w:cs="Consolas"/>
+                <w:color w:val="0000FF"/>
+                <w:sz w:val="19"/>
+                <w:szCs w:val="19"/>
+              </w:rPr>
+              <w:t>integer</w:t>
+            </w:r>
+            <w:r>
+              <w:rPr>
+                <w:rFonts w:ascii="Consolas" w:hAnsi="Consolas" w:cs="Consolas"/>
+                <w:color w:val="808080"/>
+                <w:sz w:val="19"/>
+                <w:szCs w:val="19"/>
+              </w:rPr>
+              <w:t>,</w:t>
+            </w:r>
+            <w:r>
+              <w:rPr>
+                <w:rFonts w:ascii="Consolas" w:hAnsi="Consolas" w:cs="Consolas"/>
+                <w:color w:val="000000"/>
+                <w:sz w:val="19"/>
+                <w:szCs w:val="19"/>
+              </w:rPr>
+              <w:t xml:space="preserve">  </w:t>
+            </w:r>
+          </w:p>
+          <w:p>
+            <w:pPr>
+              <w:autoSpaceDE w:val="0"/>
+              <w:autoSpaceDN w:val="0"/>
+              <w:adjustRightInd w:val="0"/>
+              <w:rPr>
+                <w:rFonts w:ascii="Consolas" w:hAnsi="Consolas" w:cs="Consolas"/>
+                <w:color w:val="000000"/>
+                <w:sz w:val="19"/>
+                <w:szCs w:val="19"/>
+              </w:rPr>
+            </w:pPr>
+            <w:r>
+              <w:rPr>
+                <w:rFonts w:ascii="Consolas" w:hAnsi="Consolas" w:cs="Consolas"/>
+                <w:color w:val="000000"/>
+                <w:sz w:val="19"/>
+                <w:szCs w:val="19"/>
+              </w:rPr>
+              <w:t xml:space="preserve">@prmtodeptid </w:t>
+            </w:r>
+            <w:r>
+              <w:rPr>
+                <w:rFonts w:ascii="Consolas" w:hAnsi="Consolas" w:cs="Consolas"/>
+                <w:color w:val="0000FF"/>
+                <w:sz w:val="19"/>
+                <w:szCs w:val="19"/>
+              </w:rPr>
+              <w:t>integer</w:t>
+            </w:r>
+            <w:r>
+              <w:rPr>
+                <w:rFonts w:ascii="Consolas" w:hAnsi="Consolas" w:cs="Consolas"/>
+                <w:color w:val="808080"/>
+                <w:sz w:val="19"/>
+                <w:szCs w:val="19"/>
+              </w:rPr>
+              <w:t>,</w:t>
+            </w:r>
+            <w:r>
+              <w:rPr>
+                <w:rFonts w:ascii="Consolas" w:hAnsi="Consolas" w:cs="Consolas"/>
+                <w:color w:val="000000"/>
+                <w:sz w:val="19"/>
+                <w:szCs w:val="19"/>
+              </w:rPr>
+              <w:t xml:space="preserve">  </w:t>
+            </w:r>
+          </w:p>
+          <w:p>
+            <w:pPr>
+              <w:autoSpaceDE w:val="0"/>
+              <w:autoSpaceDN w:val="0"/>
+              <w:adjustRightInd w:val="0"/>
+              <w:rPr>
+                <w:rFonts w:ascii="Consolas" w:hAnsi="Consolas" w:cs="Consolas"/>
+                <w:color w:val="000000"/>
+                <w:sz w:val="19"/>
+                <w:szCs w:val="19"/>
+              </w:rPr>
+            </w:pPr>
+            <w:r>
+              <w:rPr>
+                <w:rFonts w:ascii="Consolas" w:hAnsi="Consolas" w:cs="Consolas"/>
+                <w:color w:val="000000"/>
+                <w:sz w:val="19"/>
+                <w:szCs w:val="19"/>
+              </w:rPr>
+              <w:lastRenderedPageBreak/>
+              <w:t xml:space="preserve">@prmservicetypeid </w:t>
+            </w:r>
+            <w:r>
+              <w:rPr>
+                <w:rFonts w:ascii="Consolas" w:hAnsi="Consolas" w:cs="Consolas"/>
+                <w:color w:val="0000FF"/>
+                <w:sz w:val="19"/>
+                <w:szCs w:val="19"/>
+              </w:rPr>
+              <w:t>integer</w:t>
+            </w:r>
+            <w:r>
+              <w:rPr>
+                <w:rFonts w:ascii="Consolas" w:hAnsi="Consolas" w:cs="Consolas"/>
+                <w:color w:val="808080"/>
+                <w:sz w:val="19"/>
+                <w:szCs w:val="19"/>
+              </w:rPr>
+              <w:t>,</w:t>
+            </w:r>
+            <w:r>
+              <w:rPr>
+                <w:rFonts w:ascii="Consolas" w:hAnsi="Consolas" w:cs="Consolas"/>
+                <w:color w:val="000000"/>
+                <w:sz w:val="19"/>
+                <w:szCs w:val="19"/>
+              </w:rPr>
+              <w:t xml:space="preserve">  </w:t>
+            </w:r>
+          </w:p>
+          <w:p>
+            <w:pPr>
+              <w:autoSpaceDE w:val="0"/>
+              <w:autoSpaceDN w:val="0"/>
+              <w:adjustRightInd w:val="0"/>
+              <w:rPr>
+                <w:rFonts w:ascii="Consolas" w:hAnsi="Consolas" w:cs="Consolas"/>
+                <w:color w:val="000000"/>
+                <w:sz w:val="19"/>
+                <w:szCs w:val="19"/>
+              </w:rPr>
+            </w:pPr>
+            <w:r>
+              <w:rPr>
+                <w:rFonts w:ascii="Consolas" w:hAnsi="Consolas" w:cs="Consolas"/>
+                <w:color w:val="000000"/>
+                <w:sz w:val="19"/>
+                <w:szCs w:val="19"/>
+              </w:rPr>
+              <w:t xml:space="preserve">@prmvendorid </w:t>
+            </w:r>
+            <w:r>
+              <w:rPr>
+                <w:rFonts w:ascii="Consolas" w:hAnsi="Consolas" w:cs="Consolas"/>
+                <w:color w:val="0000FF"/>
+                <w:sz w:val="19"/>
+                <w:szCs w:val="19"/>
+              </w:rPr>
+              <w:t>integer</w:t>
+            </w:r>
+            <w:r>
+              <w:rPr>
+                <w:rFonts w:ascii="Consolas" w:hAnsi="Consolas" w:cs="Consolas"/>
+                <w:color w:val="808080"/>
+                <w:sz w:val="19"/>
+                <w:szCs w:val="19"/>
+              </w:rPr>
+              <w:t>,</w:t>
+            </w:r>
+            <w:r>
+              <w:rPr>
+                <w:rFonts w:ascii="Consolas" w:hAnsi="Consolas" w:cs="Consolas"/>
+                <w:color w:val="000000"/>
+                <w:sz w:val="19"/>
+                <w:szCs w:val="19"/>
+              </w:rPr>
+              <w:t xml:space="preserve">  </w:t>
+            </w:r>
+          </w:p>
+          <w:p>
+            <w:pPr>
+              <w:rPr>
+                <w:rFonts w:ascii="Calibri" w:eastAsia="Calibri" w:hAnsi="Calibri" w:cs="Calibri"/>
+                <w:color w:val="166534"/>
+                <w:sz w:val="19"/>
+                <w:szCs w:val="19"/>
+              </w:rPr>
+            </w:pPr>
+            <w:r>
+              <w:rPr>
+                <w:rFonts w:ascii="Consolas" w:hAnsi="Consolas" w:cs="Consolas"/>
+                <w:color w:val="000000"/>
+                <w:sz w:val="19"/>
+                <w:szCs w:val="19"/>
+              </w:rPr>
+              <w:t xml:space="preserve">@prmconfigid </w:t>
+            </w:r>
+            <w:proofErr w:type="gramStart"/>
+            <w:r>
+              <w:rPr>
+                <w:rFonts w:ascii="Consolas" w:hAnsi="Consolas" w:cs="Consolas"/>
+                <w:color w:val="0000FF"/>
+                <w:sz w:val="19"/>
+                <w:szCs w:val="19"/>
+              </w:rPr>
+              <w:t>integer</w:t>
+            </w:r>
+            <w:r>
+              <w:rPr>
+                <w:rFonts w:ascii="Consolas" w:hAnsi="Consolas" w:cs="Consolas"/>
+                <w:color w:val="000000"/>
+                <w:sz w:val="19"/>
+                <w:szCs w:val="19"/>
+              </w:rPr>
+              <w:t xml:space="preserve">  )</w:t>
+            </w:r>
+            <w:proofErr w:type="gramEnd"/>
+          </w:p>
+        </w:tc>
+        <w:tc>
+          <w:tcPr>
+            <w:tcW w:w="1558" w:type="pct"/>
+            <w:tcBorders>
+              <w:top w:val="single" w:sz="4" w:space="0" w:color="CBD5E1"/>
+              <w:left w:val="single" w:sz="4" w:space="0" w:color="CBD5E1"/>
+              <w:bottom w:val="single" w:sz="4" w:space="0" w:color="CBD5E1"/>
+              <w:right w:val="single" w:sz="4" w:space="0" w:color="CBD5E1"/>
+            </w:tcBorders>
+            <w:shd w:val="clear" w:color="auto" w:fill="F0FDF4"/>
+            <w:tcMar>
+              <w:top w:w="80" w:type="dxa"/>
+              <w:left w:w="120" w:type="dxa"/>
+              <w:bottom w:w="80" w:type="dxa"/>
+              <w:right w:w="120" w:type="dxa"/>
+            </w:tcMar>
+          </w:tcPr>
+          <w:p>
+            <w:pPr>
+              <w:rPr>
+                <w:rFonts w:ascii="Calibri" w:eastAsia="Calibri" w:hAnsi="Calibri" w:cs="Calibri"/>
+                <w:color w:val="166534"/>
+                <w:sz w:val="19"/>
+                <w:szCs w:val="19"/>
+              </w:rPr>
+            </w:pPr>
           </w:p>
         </w:tc>
       </w:tr>
@@ -8963,16 +10923,7 @@
                 <w:sz w:val="21"/>
                 <w:szCs w:val="21"/>
               </w:rPr>
-              <w:t>/</w:t>
-            </w:r>
-            <w:r>
-              <w:rPr>
-                <w:rFonts w:ascii="Calibri" w:eastAsia="Calibri" w:hAnsi="Calibri" w:cs="Calibri"/>
-                <w:color w:val="166534"/>
-                <w:sz w:val="21"/>
-                <w:szCs w:val="21"/>
-              </w:rPr>
-              <w:t xml:space="preserve"> API/</w:t>
+              <w:t>/ API/</w:t>
             </w:r>
             <w:r>
               <w:rPr>
@@ -9168,7 +11119,7 @@
                 <w:sz w:val="19"/>
                 <w:szCs w:val="19"/>
               </w:rPr>
-              <w:t>rb_mntcomplmst</w:t>
+              <w:t>rb_mntcpnmst</w:t>
             </w:r>
             <w:r>
               <w:rPr>
@@ -9238,6 +11189,15 @@
               </w:rPr>
               <w:t>,</w:t>
             </w:r>
+            <w:r>
+              <w:rPr>
+                <w:rFonts w:ascii="Consolas" w:hAnsi="Consolas" w:cs="Consolas"/>
+                <w:color w:val="000000"/>
+                <w:sz w:val="19"/>
+                <w:szCs w:val="19"/>
+              </w:rPr>
+              <w:t xml:space="preserve">  </w:t>
+            </w:r>
           </w:p>
           <w:p>
             <w:pPr>
@@ -9278,6 +11238,15 @@
               </w:rPr>
               <w:t>,</w:t>
             </w:r>
+            <w:r>
+              <w:rPr>
+                <w:rFonts w:ascii="Consolas" w:hAnsi="Consolas" w:cs="Consolas"/>
+                <w:color w:val="000000"/>
+                <w:sz w:val="19"/>
+                <w:szCs w:val="19"/>
+              </w:rPr>
+              <w:t xml:space="preserve">  </w:t>
+            </w:r>
           </w:p>
           <w:p>
             <w:pPr>
@@ -9318,6 +11287,15 @@
               </w:rPr>
               <w:t>,</w:t>
             </w:r>
+            <w:r>
+              <w:rPr>
+                <w:rFonts w:ascii="Consolas" w:hAnsi="Consolas" w:cs="Consolas"/>
+                <w:color w:val="000000"/>
+                <w:sz w:val="19"/>
+                <w:szCs w:val="19"/>
+              </w:rPr>
+              <w:t xml:space="preserve">  </w:t>
+            </w:r>
           </w:p>
           <w:p>
             <w:pPr>
@@ -9358,6 +11336,15 @@
               </w:rPr>
               <w:t>,</w:t>
             </w:r>
+            <w:r>
+              <w:rPr>
+                <w:rFonts w:ascii="Consolas" w:hAnsi="Consolas" w:cs="Consolas"/>
+                <w:color w:val="000000"/>
+                <w:sz w:val="19"/>
+                <w:szCs w:val="19"/>
+              </w:rPr>
+              <w:t xml:space="preserve">  </w:t>
+            </w:r>
           </w:p>
           <w:p>
             <w:pPr>
@@ -9398,6 +11385,15 @@
               </w:rPr>
               <w:t>,</w:t>
             </w:r>
+            <w:r>
+              <w:rPr>
+                <w:rFonts w:ascii="Consolas" w:hAnsi="Consolas" w:cs="Consolas"/>
+                <w:color w:val="000000"/>
+                <w:sz w:val="19"/>
+                <w:szCs w:val="19"/>
+              </w:rPr>
+              <w:t xml:space="preserve">  </w:t>
+            </w:r>
           </w:p>
           <w:p>
             <w:pPr>
@@ -9438,6 +11434,15 @@
               </w:rPr>
               <w:t>,</w:t>
             </w:r>
+            <w:r>
+              <w:rPr>
+                <w:rFonts w:ascii="Consolas" w:hAnsi="Consolas" w:cs="Consolas"/>
+                <w:color w:val="000000"/>
+                <w:sz w:val="19"/>
+                <w:szCs w:val="19"/>
+              </w:rPr>
+              <w:t xml:space="preserve">  </w:t>
+            </w:r>
           </w:p>
           <w:p>
             <w:pPr>
@@ -9477,6 +11482,15 @@
                 <w:szCs w:val="19"/>
               </w:rPr>
               <w:t>,</w:t>
+            </w:r>
+            <w:r>
+              <w:rPr>
+                <w:rFonts w:ascii="Consolas" w:hAnsi="Consolas" w:cs="Consolas"/>
+                <w:color w:val="000000"/>
+                <w:sz w:val="19"/>
+                <w:szCs w:val="19"/>
+              </w:rPr>
+              <w:t xml:space="preserve">  </w:t>
             </w:r>
           </w:p>
           <w:p>
@@ -9546,25 +11560,7 @@
                 <w:sz w:val="19"/>
                 <w:szCs w:val="19"/>
               </w:rPr>
-              <w:t xml:space="preserve">Edit Mode </w:t>
-            </w:r>
-            <w:r>
-              <w:rPr>
-                <w:rFonts w:ascii="Calibri" w:eastAsia="Calibri" w:hAnsi="Calibri" w:cs="Calibri"/>
-                <w:color w:val="166534"/>
-                <w:sz w:val="19"/>
-                <w:szCs w:val="19"/>
-              </w:rPr>
-              <w:t>–</w:t>
-            </w:r>
-            <w:r>
-              <w:rPr>
-                <w:rFonts w:ascii="Calibri" w:eastAsia="Calibri" w:hAnsi="Calibri" w:cs="Calibri"/>
-                <w:color w:val="166534"/>
-                <w:sz w:val="19"/>
-                <w:szCs w:val="19"/>
-              </w:rPr>
-              <w:t xml:space="preserve"> Master</w:t>
+              <w:t>Edit Mode – Master</w:t>
             </w:r>
           </w:p>
         </w:tc>
@@ -9611,7 +11607,7 @@
                 <w:sz w:val="19"/>
                 <w:szCs w:val="19"/>
               </w:rPr>
-              <w:t>rb_mntcomplmst</w:t>
+              <w:t>rb_mntcpnmst</w:t>
             </w:r>
             <w:proofErr w:type="spellEnd"/>
           </w:p>
@@ -9738,7 +11734,7 @@
                 <w:sz w:val="19"/>
                 <w:szCs w:val="19"/>
               </w:rPr>
-              <w:t>rb_mntcompldet</w:t>
+              <w:t>rb_mntcpndet</w:t>
             </w:r>
             <w:proofErr w:type="spellEnd"/>
           </w:p>
@@ -9847,7 +11843,6 @@
           <w:sz w:val="21"/>
           <w:szCs w:val="21"/>
         </w:rPr>
-        <w:lastRenderedPageBreak/>
         <w:t>1</w:t>
       </w:r>
       <w:r>
@@ -9902,7 +11897,31 @@
           <w:sz w:val="24"/>
           <w:szCs w:val="24"/>
         </w:rPr>
-        <w:t>7. Constants  (constants.js)</w:t>
+        <w:t xml:space="preserve">7. </w:t>
+      </w:r>
+      <w:proofErr w:type="gramStart"/>
+      <w:r>
+        <w:rPr>
+          <w:rFonts w:ascii="Calibri" w:eastAsia="Calibri" w:hAnsi="Calibri" w:cs="Calibri"/>
+          <w:b/>
+          <w:bCs/>
+          <w:color w:val="FFFFFF"/>
+          <w:sz w:val="24"/>
+          <w:szCs w:val="24"/>
+        </w:rPr>
+        <w:t>Constants  (</w:t>
+      </w:r>
+      <w:proofErr w:type="gramEnd"/>
+      <w:r>
+        <w:rPr>
+          <w:rFonts w:ascii="Calibri" w:eastAsia="Calibri" w:hAnsi="Calibri" w:cs="Calibri"/>
+          <w:b/>
+          <w:bCs/>
+          <w:color w:val="FFFFFF"/>
+          <w:sz w:val="24"/>
+          <w:szCs w:val="24"/>
+        </w:rPr>
+        <w:t>constants.js)</w:t>
       </w:r>
     </w:p>
     <w:p>
@@ -10152,7 +12171,7 @@
                 <w:sz w:val="19"/>
                 <w:szCs w:val="19"/>
               </w:rPr>
-              <w:t>rb_mntcomplmst</w:t>
+              <w:t>rb_mntcpnmst</w:t>
             </w:r>
             <w:proofErr w:type="spellEnd"/>
           </w:p>
@@ -10272,7 +12291,7 @@
                 <w:sz w:val="19"/>
                 <w:szCs w:val="19"/>
               </w:rPr>
-              <w:t>rb_mntcompldet</w:t>
+              <w:t>rb_mntcpndet</w:t>
             </w:r>
             <w:proofErr w:type="spellEnd"/>
           </w:p>
@@ -10386,7 +12405,7 @@
           <w:p>
             <w:proofErr w:type="spellStart"/>
             <w:r>
-              <w:t>rb_mntcomplmst</w:t>
+              <w:t>rb_mntcpnmst</w:t>
             </w:r>
             <w:proofErr w:type="spellEnd"/>
           </w:p>
@@ -10476,6 +12495,7 @@
                 <w:sz w:val="19"/>
                 <w:szCs w:val="19"/>
               </w:rPr>
+              <w:lastRenderedPageBreak/>
               <w:t>TRAN_BOOK</w:t>
             </w:r>
           </w:p>
@@ -10505,7 +12525,7 @@
                 <w:sz w:val="19"/>
                 <w:szCs w:val="19"/>
               </w:rPr>
-              <w:t>HS</w:t>
+              <w:t>CPN</w:t>
             </w:r>
           </w:p>
         </w:tc>
@@ -11126,7 +13146,7 @@
                 <w:sz w:val="19"/>
                 <w:szCs w:val="19"/>
               </w:rPr>
-              <w:t>rb_mntcomplmst</w:t>
+              <w:t>rb_mntcpnmst</w:t>
             </w:r>
             <w:r>
               <w:rPr>
@@ -12464,31 +14484,31 @@
       </w:pPr>
     </w:lvl>
   </w:abstractNum>
-  <w:num w:numId="1" w16cid:durableId="958952368">
+  <w:num w:numId="1" w16cid:durableId="59905376">
     <w:abstractNumId w:val="6"/>
     <w:lvlOverride w:ilvl="0">
       <w:startOverride w:val="1"/>
     </w:lvlOverride>
   </w:num>
-  <w:num w:numId="2" w16cid:durableId="1766152389">
+  <w:num w:numId="2" w16cid:durableId="1439712196">
     <w:abstractNumId w:val="7"/>
   </w:num>
-  <w:num w:numId="3" w16cid:durableId="1751347370">
+  <w:num w:numId="3" w16cid:durableId="1464884478">
     <w:abstractNumId w:val="2"/>
   </w:num>
-  <w:num w:numId="4" w16cid:durableId="1140999172">
+  <w:num w:numId="4" w16cid:durableId="2033454057">
     <w:abstractNumId w:val="1"/>
   </w:num>
-  <w:num w:numId="5" w16cid:durableId="693724464">
+  <w:num w:numId="5" w16cid:durableId="1694266652">
     <w:abstractNumId w:val="4"/>
   </w:num>
-  <w:num w:numId="6" w16cid:durableId="1707101436">
+  <w:num w:numId="6" w16cid:durableId="1074741353">
     <w:abstractNumId w:val="3"/>
   </w:num>
-  <w:num w:numId="7" w16cid:durableId="1398162010">
+  <w:num w:numId="7" w16cid:durableId="1904220090">
     <w:abstractNumId w:val="0"/>
   </w:num>
-  <w:num w:numId="8" w16cid:durableId="237254691">
+  <w:num w:numId="8" w16cid:durableId="754665073">
     <w:abstractNumId w:val="5"/>
   </w:num>
 </w:numbering>
@@ -12958,6 +14978,7 @@
   <w:style w:type="character" w:default="1" w:styleId="DefaultParagraphFont">
     <w:name w:val="Default Paragraph Font"/>
     <w:uiPriority w:val="1"/>
+    <w:semiHidden/>
     <w:unhideWhenUsed/>
   </w:style>
   <w:style w:type="table" w:default="1" w:styleId="TableNormal">
@@ -13363,7 +15384,7 @@
 </file>
 
 <file path=customXml/itemProps1.xml><?xml version="1.0" encoding="utf-8"?>
-<ds:datastoreItem xmlns:ds="http://schemas.openxmlformats.org/officeDocument/2006/customXml" ds:itemID="{6118ACA8-953B-457B-9273-43306B1FD416}">
+<ds:datastoreItem xmlns:ds="http://schemas.openxmlformats.org/officeDocument/2006/customXml" ds:itemID="{9A050C68-033C-4AE9-8753-240FF33C5686}">
   <ds:schemaRefs>
     <ds:schemaRef ds:uri="http://schemas.openxmlformats.org/officeDocument/2006/bibliography"/>
   </ds:schemaRefs>

</xml_diff>